<commit_message>
docs(evidence): add technical annex, fix voice/tics in Demo Day doc
Anexo A: real agent roster and their authority limits, the CLAUDE.md
governance file hierarchy, why some agent responsibilities moved to
Skills (the actual token-consumption problem this solved), and when/
why Main was granted autonomous commit/push authority with its explicit
destructive-operation limit.

Also removed every "honestamente"/"sin maquillar" self-narration tic
per the second writing-style correction recorded in memory today,
matching the register of the author's own prior successful submission
(A01451839_ACTDemo.pdf's Reporte de avance) rather than an exec-report
voice.
</commit_message>
<xml_diff>
--- a/evidence/2026-08-22-demo-day/Nahui - Documento Ejecutivo Demo Day.docx
+++ b/evidence/2026-08-22-demo-day/Nahui - Documento Ejecutivo Demo Day.docx
@@ -2,7 +2,7 @@
 <file path=word/document.xml><?xml version="1.0" encoding="utf-8"?>
 <w:document xmlns:w="http://schemas.openxmlformats.org/wordprocessingml/2006/main" xmlns:m="http://schemas.openxmlformats.org/officeDocument/2006/math" xmlns:r="http://schemas.openxmlformats.org/officeDocument/2006/relationships" xmlns:o="urn:schemas-microsoft-com:office:office" xmlns:v="urn:schemas-microsoft-com:vml" xmlns:w10="urn:schemas-microsoft-com:office:word" xmlns:a="http://schemas.openxmlformats.org/drawingml/2006/main" xmlns:pic="http://schemas.openxmlformats.org/drawingml/2006/picture" xmlns:wp="http://schemas.openxmlformats.org/drawingml/2006/wordprocessingDrawing">
   <w:body>
-    <w:bookmarkStart w:id="16" w:name="nahui-documento-ejecutivo-demo-day"/>
+    <w:bookmarkStart w:id="21" w:name="nahui-documento-ejecutivo-demo-day"/>
     <w:p>
       <w:pPr>
         <w:pStyle w:val="Heading1"/>
@@ -106,7 +106,7 @@
         <w:t xml:space="preserve"> </w:t>
       </w:r>
       <w:r>
-        <w:t xml:space="preserve">(resultado de una fórmula). Nada aquí se presenta como más cierto de lo que realmente es.</w:t>
+        <w:t xml:space="preserve">(resultado de una fórmula).</w:t>
       </w:r>
     </w:p>
     <w:p>
@@ -186,7 +186,7 @@
         <w:t xml:space="preserve">“ya perdería el control”</w:t>
       </w:r>
       <w:r>
-        <w:t xml:space="preserve">, palabras textuales de la entrevista original de Sesión 1. No tengo una cifra exacta de ventas perdidas de parte de Ana, ella no me la dio, y lo digo así de honesto desde el diagnóstico original. Sí tengo evidencia de industria: negocios que llevan el control de memoria o en notas sueltas terminan con desabasto de lo que más se vende y exceso de lo que no se mueve, perdiendo dinero sin darse cuenta (Clip, blog especializado en pagos y ventas).</w:t>
+        <w:t xml:space="preserve">, palabras textuales de la entrevista original de Sesión 1. No tengo una cifra exacta de ventas perdidas de parte de Ana, ella no me la dio. Sí tengo evidencia de industria: negocios que llevan el control de memoria o en notas sueltas terminan con desabasto de lo que más se vende y exceso de lo que no se mueve, perdiendo dinero sin darse cuenta (Clip, blog especializado en pagos y ventas).</w:t>
       </w:r>
     </w:p>
     <w:p>
@@ -298,7 +298,7 @@
         <w:t xml:space="preserve"> </w:t>
       </w:r>
       <w:r>
-        <w:t xml:space="preserve">Nahui no la construí sola con ayuda de un asistente de IA. La construye un equipo real de agentes de IA especializados, cada uno con autoridad propia sobre su área (diseño de producto, revisión de marca, arquitectura, marketing, validación), coordinados bajo un marco explícito de quién decide qué. No es una metáfora de gestión de proyecto, es literalmente cómo se tomó cada decisión de este documento.</w:t>
+        <w:t xml:space="preserve">Nahui no la construí sola con ayuda de un asistente de IA. La construye un equipo real de agentes de IA especializados, cada uno con autoridad propia sobre su área (diseño de producto, revisión de marca, arquitectura, marketing, validación), coordinados bajo un marco explícito de quién decide qué. No es una metáfora de gestión de proyecto, es literalmente cómo se tomó cada decisión de este documento. El detalle completo de cómo funciona esa arquitectura está en el Anexo A.</w:t>
       </w:r>
     </w:p>
     <w:p>
@@ -379,23 +379,7 @@
         <w:t xml:space="preserve"> </w:t>
       </w:r>
       <w:r>
-        <w:t xml:space="preserve">Ana usó el producto real y le encantó, evidencia cualitativa real, de primera mano, no una intuición mía. Pero tengo que ser igual de honesta con lo que no funcionó: una campaña de Meta que acabo de cerrar generó alcance real y barato ($530 MXN gastados, 19,268 personas de alcance, $0.81 MXN por clic, el costo de atraer atención no es el problema) pero prácticamente</w:t>
-      </w:r>
-      <w:r>
-        <w:t xml:space="preserve"> </w:t>
-      </w:r>
-      <w:r>
-        <w:rPr>
-          <w:b/>
-          <w:bCs/>
-        </w:rPr>
-        <w:t xml:space="preserve">cero comerciantes reales, fuera de Ana y de mi propio equipo, llegaron a probar el demo.</w:t>
-      </w:r>
-      <w:r>
-        <w:t xml:space="preserve"> </w:t>
-      </w:r>
-      <w:r>
-        <w:t xml:space="preserve">La causa exacta todavía no está confirmada, y decirlo así, sin inventar una causa que suene bien, es parte de la validación, no una falla en reportarla.</w:t>
+        <w:t xml:space="preserve">Ana usó el producto real y le encantó, evidencia cualitativa real, de primera mano, no una intuición mía. Una campaña de Meta que acabo de cerrar generó alcance real y barato ($530 MXN gastados, 19,268 personas de alcance, $0.81 MXN por clic, el costo de atraer atención no es el problema) pero prácticamente cero comerciantes reales, fuera de Ana y de mi propio equipo, llegaron a probar el demo. La causa exacta todavía no está confirmada.</w:t>
       </w:r>
     </w:p>
     <w:p>
@@ -413,7 +397,7 @@
         <w:t xml:space="preserve"> </w:t>
       </w:r>
       <w:r>
-        <w:t xml:space="preserve">no escalar el gasto publicitario sobre una causa que no he confirmado. En vez de eso, diseñé un piloto pequeño y controlado (Concierge/DM, MXN $200, tope de 20 conversaciones, ventana de 2 días) con un marco de evidencia definido antes de la primera conversación: cinco hipótesis candidatas de por qué no están entrando, incluida una hipótesis nula, para que el marco no me pueda forzar a una conclusión de producto por diseño. Es una decisión de iterar en cómo aprendo, no de escalar ni de descartar el canal, exactamente lo que la evidencia real (mucho alcance, cero conversión confirmada) sostiene, ni más ni menos.</w:t>
+        <w:t xml:space="preserve">no escalar el gasto publicitario sobre una causa que no he confirmado. En vez de eso, diseñé un piloto pequeño y controlado (Concierge/DM, MXN $200, tope de 20 conversaciones, ventana de 2 días) con un marco de evidencia definido antes de la primera conversación: cinco hipótesis candidatas de por qué no están entrando, incluida una hipótesis nula, para que el marco no me pueda forzar a una conclusión de producto por diseño. Es una decisión de iterar en cómo aprendo, no de escalar ni de descartar el canal.</w:t>
       </w:r>
     </w:p>
     <w:p>
@@ -425,13 +409,13 @@
           <w:b/>
           <w:bCs/>
         </w:rPr>
-        <w:t xml:space="preserve">Límite honesto:</w:t>
-      </w:r>
-      <w:r>
-        <w:t xml:space="preserve"> </w:t>
-      </w:r>
-      <w:r>
-        <w:t xml:space="preserve">toda la validación de experiencia de uso real hasta hoy viene de una sola persona, observada de cerca por mí y mi equipo. Es evidencia real, pero de un solo caso, no de una comunidad. Prefiero decirlo así que maquillarlo.</w:t>
+        <w:t xml:space="preserve">Límite de esta validación:</w:t>
+      </w:r>
+      <w:r>
+        <w:t xml:space="preserve"> </w:t>
+      </w:r>
+      <w:r>
+        <w:t xml:space="preserve">toda la experiencia de uso real hasta hoy viene de una sola persona, observada de cerca por mí y mi equipo. Es evidencia real, pero de un solo caso, no de una comunidad.</w:t>
       </w:r>
     </w:p>
     <w:p>
@@ -874,7 +858,7 @@
         <w:t xml:space="preserve"> </w:t>
       </w:r>
       <w:r>
-        <w:t xml:space="preserve">honestamente, todavía no lo puedo calcular de forma defendible. No existe una cifra de precio decidida (</w:t>
+        <w:t xml:space="preserve">todavía no lo puedo calcular de forma defendible. No existe una cifra de precio decidida (</w:t>
       </w:r>
       <w:r>
         <w:rPr>
@@ -883,7 +867,7 @@
         <w:t xml:space="preserve">company/business-decisions.md</w:t>
       </w:r>
       <w:r>
-        <w:t xml:space="preserve">), solo principios (sin comisión por transacción, precio fijo o estacional). Prefiero nombrarlo como brecha abierta que inventar un número para llenar la tabla.</w:t>
+        <w:t xml:space="preserve">), solo principios (sin comisión por transacción, precio fijo o estacional).</w:t>
       </w:r>
     </w:p>
     <w:p>
@@ -918,7 +902,7 @@
         <w:t xml:space="preserve"> </w:t>
       </w:r>
       <w:r>
-        <w:t xml:space="preserve">cada decisión se clasifica explícitamente como Arquitectura, Producto o Negocio, y se rutea a quien le corresponde resolverla. Nunca invento una respuesta para llenar un vacío. Esto no es solo diseño en papel, esta misma semana el agente</w:t>
+        <w:t xml:space="preserve">cada decisión se clasifica explícitamente como Arquitectura, Producto o Negocio, y se rutea a quien le corresponde resolverla. Esta misma semana, el agente</w:t>
       </w:r>
       <w:r>
         <w:t xml:space="preserve"> </w:t>
@@ -933,7 +917,7 @@
         <w:t xml:space="preserve"> </w:t>
       </w:r>
       <w:r>
-        <w:t xml:space="preserve">rechazó una instrucción que le daba permiso para escribir fuera de su alcance declarado, aun viniendo dentro de un mensaje de tarea, porque no podía verificarla como una autorización real. Exigió que el permiso existiera de forma persistida en su propia configuración. Es exactamente el patrón de gobernanza que busco (autoridad real, no</w:t>
+        <w:t xml:space="preserve">rechazó una instrucción que le daba permiso para escribir fuera de su alcance declarado, aun viniendo dentro de un mensaje de tarea, porque no podía verificarla como una autorización real. Exigió que el permiso existiera de forma persistida en su propia configuración. Es el patrón de gobernanza que busco (autoridad real, no</w:t>
       </w:r>
       <w:r>
         <w:t xml:space="preserve"> </w:t>
@@ -942,7 +926,7 @@
         <w:t xml:space="preserve">“se decide en el pasillo”</w:t>
       </w:r>
       <w:r>
-        <w:t xml:space="preserve">) funcionando en un caso real, no hipotético.</w:t>
+        <w:t xml:space="preserve">) funcionando en un caso real. El roster completo de agentes y cómo se gobiernan está en el Anexo A.</w:t>
       </w:r>
     </w:p>
     <w:p>
@@ -960,16 +944,7 @@
         <w:t xml:space="preserve"> </w:t>
       </w:r>
       <w:r>
-        <w:t xml:space="preserve">honestamente, no tengo todavía una cadencia fija. Las decisiones de negocio abiertas las reviso</w:t>
-      </w:r>
-      <w:r>
-        <w:t xml:space="preserve"> </w:t>
-      </w:r>
-      <w:r>
-        <w:t xml:space="preserve">“cuando hay espacio”</w:t>
-      </w:r>
-      <w:r>
-        <w:t xml:space="preserve">, no en una fecha calendarizada. Es la brecha de gobernanza más real que puedo nombrar hoy, no una que prefiera esconder.</w:t>
+        <w:t xml:space="preserve">no tengo todavía una cadencia fija. Las decisiones de negocio abiertas las reviso cuando hay espacio, no en una fecha calendarizada. Es la brecha de gobernanza más clara que tengo hoy.</w:t>
       </w:r>
     </w:p>
     <w:p>
@@ -1503,7 +1478,7 @@
           <w:b/>
           <w:bCs/>
         </w:rPr>
-        <w:t xml:space="preserve">A quién le cambia el trabajo, respuesta honesta, no forzada al formato de una organización con personal ya establecido:</w:t>
+        <w:t xml:space="preserve">A quién le cambia el trabajo:</w:t>
       </w:r>
       <w:r>
         <w:t xml:space="preserve"> </w:t>
@@ -1527,7 +1502,7 @@
         <w:t xml:space="preserve"> </w:t>
       </w:r>
       <w:r>
-        <w:t xml:space="preserve">Ana ya me dijo, en otra conversación, que no quiere que la metan a plataformas tipo Amazon o Mercado Pago por las comisiones que cobran. La respuesta honesta no es una promesa vacía, es una decisión de diseño que ya tomé: Nahui explícitamente no cobra comisión por transacción, justo para no replicar ese modelo de intermediario.</w:t>
+        <w:t xml:space="preserve">Ana ya me dijo, en otra conversación, que no quiere que la metan a plataformas tipo Amazon o Mercado Pago por las comisiones que cobran. Nahui explícitamente no cobra comisión por transacción, decisión de diseño ya tomada, justo para no replicar ese modelo de intermediario.</w:t>
       </w:r>
     </w:p>
     <w:p>
@@ -1545,7 +1520,7 @@
         <w:t xml:space="preserve"> </w:t>
       </w:r>
       <w:r>
-        <w:t xml:space="preserve">una pantalla de bienvenida honesta (ya construida,</w:t>
+        <w:t xml:space="preserve">una pantalla de bienvenida (ya construida,</w:t>
       </w:r>
       <w:r>
         <w:t xml:space="preserve"> </w:t>
@@ -1784,7 +1759,7 @@
               <w:pStyle w:val="Compact"/>
             </w:pPr>
             <w:r>
-              <w:t xml:space="preserve">Por definir, brecha abierta hoy</w:t>
+              <w:t xml:space="preserve">Por definir</w:t>
             </w:r>
           </w:p>
         </w:tc>
@@ -1889,7 +1864,7 @@
         <w:t xml:space="preserve">Creí que el reto más difícil sería técnico</w:t>
       </w:r>
       <w:r>
-        <w:t xml:space="preserve">, construir el motor de recomendaciones, el machine learning del sueño de largo plazo. Resultó que el reto real, el que hay que resolver primero, es mucho más simple de describir y mucho más difícil de lograr: que la primera vendedora real, fuera de Ana y de mí misma probando, cruce la puerta. La campaña de esta semana lo confirmó de la forma más honesta posible, con datos, no con intuición.</w:t>
+        <w:t xml:space="preserve">, construir el motor de recomendaciones, el machine learning del sueño de largo plazo. Resultó que el reto real, el que hay que resolver primero, es mucho más simple de describir y mucho más difícil de lograr: que la primera vendedora real, fuera de Ana y de mí misma probando, cruce la puerta. La campaña de esta semana lo confirmó con datos, no con intuición.</w:t>
       </w:r>
     </w:p>
     <w:p>
@@ -1941,11 +1916,738 @@
         <w:pStyle w:val="FirstParagraph"/>
       </w:pPr>
       <w:r>
-        <w:t xml:space="preserve">Nada de esto se sintió cómodo mientras pasaba. Pero es exactamente lo que me deja algo real que presentar hoy, en vez de una historia bonita que no hubiera sobrevivido una pregunta difícil del panel.</w:t>
+        <w:t xml:space="preserve">Nada de esto se sintió cómodo mientras pasaba. Es exactamente lo que me deja algo real que presentar hoy, en vez de una historia bonita que no hubiera sobrevivido una pregunta difícil del panel.</w:t>
+      </w:r>
+    </w:p>
+    <w:p>
+      <w:r>
+        <w:pict>
+          <v:rect style="width:0;height:1.5pt" o:hralign="center" o:hrstd="t" o:hr="t"/>
+        </w:pict>
       </w:r>
     </w:p>
     <w:bookmarkEnd w:id="15"/>
+    <w:bookmarkStart w:id="20" w:name="X1079421895635caf77f1384fa6084c0be475877"/>
+    <w:p>
+      <w:pPr>
+        <w:pStyle w:val="Heading2"/>
+      </w:pPr>
+      <w:r>
+        <w:t xml:space="preserve">Anexo A: Arquitectura de gobernanza multi-agente</w:t>
+      </w:r>
+    </w:p>
+    <w:p>
+      <w:pPr>
+        <w:pStyle w:val="FirstParagraph"/>
+      </w:pPr>
+      <w:r>
+        <w:rPr>
+          <w:i/>
+          <w:iCs/>
+        </w:rPr>
+        <w:t xml:space="preserve">(Anexo, no cuenta contra el límite de 7 páginas.)</w:t>
+      </w:r>
+    </w:p>
+    <w:bookmarkStart w:id="16" w:name="X15126714b4fa16c45fe24244a4cab857f5991b7"/>
+    <w:p>
+      <w:pPr>
+        <w:pStyle w:val="Heading3"/>
+      </w:pPr>
+      <w:r>
+        <w:t xml:space="preserve">A.1 El roster de agentes y qué autoridad tiene cada uno</w:t>
+      </w:r>
+    </w:p>
+    <w:p>
+      <w:pPr>
+        <w:pStyle w:val="FirstParagraph"/>
+      </w:pPr>
+      <w:r>
+        <w:t xml:space="preserve">Nahui no la construye una sola IA generalista. La construye un conjunto de agentes especializados, cada uno con su propio archivo de definición, su propio conjunto de herramientas, y su propio límite de qué puede y qué no puede hacer.</w:t>
+      </w:r>
+    </w:p>
+    <w:tbl>
+      <w:tblPr>
+        <w:tblStyle w:val="Table"/>
+        <w:tblW w:type="pct" w:w="5000"/>
+        <w:tblLayout w:type="fixed"/>
+        <w:tblLook w:firstRow="1" w:lastRow="0" w:firstColumn="0" w:lastColumn="0" w:noHBand="0" w:noVBand="0" w:val="0020"/>
+      </w:tblPr>
+      <w:tblGrid>
+        <w:gridCol w:w="2640"/>
+        <w:gridCol w:w="2640"/>
+        <w:gridCol w:w="2640"/>
+      </w:tblGrid>
+      <w:tr>
+        <w:trPr>
+          <w:tblHeader w:val="on"/>
+        </w:trPr>
+        <w:tc>
+          <w:tcPr/>
+          <w:p>
+            <w:pPr>
+              <w:pStyle w:val="Compact"/>
+            </w:pPr>
+            <w:r>
+              <w:t xml:space="preserve">Agente</w:t>
+            </w:r>
+          </w:p>
+        </w:tc>
+        <w:tc>
+          <w:tcPr/>
+          <w:p>
+            <w:pPr>
+              <w:pStyle w:val="Compact"/>
+            </w:pPr>
+            <w:r>
+              <w:t xml:space="preserve">Qué hace</w:t>
+            </w:r>
+          </w:p>
+        </w:tc>
+        <w:tc>
+          <w:tcPr/>
+          <w:p>
+            <w:pPr>
+              <w:pStyle w:val="Compact"/>
+            </w:pPr>
+            <w:r>
+              <w:t xml:space="preserve">Qué autoridad tiene</w:t>
+            </w:r>
+          </w:p>
+        </w:tc>
+      </w:tr>
+      <w:tr>
+        <w:tc>
+          <w:tcPr/>
+          <w:p>
+            <w:pPr>
+              <w:pStyle w:val="Compact"/>
+            </w:pPr>
+            <w:r>
+              <w:rPr>
+                <w:rStyle w:val="VerbatimChar"/>
+              </w:rPr>
+              <w:t xml:space="preserve">architect</w:t>
+            </w:r>
+          </w:p>
+        </w:tc>
+        <w:tc>
+          <w:tcPr/>
+          <w:p>
+            <w:pPr>
+              <w:pStyle w:val="Compact"/>
+            </w:pPr>
+            <w:r>
+              <w:t xml:space="preserve">Revisa cualquier propuesta nueva contra el modelo de dominio congelado antes de que se planee o construya</w:t>
+            </w:r>
+          </w:p>
+        </w:tc>
+        <w:tc>
+          <w:tcPr/>
+          <w:p>
+            <w:pPr>
+              <w:pStyle w:val="Compact"/>
+            </w:pPr>
+            <w:r>
+              <w:t xml:space="preserve">Solo lectura, nunca escribe código ni especificaciones</w:t>
+            </w:r>
+          </w:p>
+        </w:tc>
+      </w:tr>
+      <w:tr>
+        <w:tc>
+          <w:tcPr/>
+          <w:p>
+            <w:pPr>
+              <w:pStyle w:val="Compact"/>
+            </w:pPr>
+            <w:r>
+              <w:rPr>
+                <w:rStyle w:val="VerbatimChar"/>
+              </w:rPr>
+              <w:t xml:space="preserve">ux-designer</w:t>
+            </w:r>
+          </w:p>
+        </w:tc>
+        <w:tc>
+          <w:tcPr/>
+          <w:p>
+            <w:pPr>
+              <w:pStyle w:val="Compact"/>
+            </w:pPr>
+            <w:r>
+              <w:t xml:space="preserve">Produce especificaciones de Baja Fidelidad (comportamiento, flujos, wireframes de texto)</w:t>
+            </w:r>
+          </w:p>
+        </w:tc>
+        <w:tc>
+          <w:tcPr/>
+          <w:p>
+            <w:pPr>
+              <w:pStyle w:val="Compact"/>
+            </w:pPr>
+            <w:r>
+              <w:t xml:space="preserve">Define comportamiento, nunca construye la interfaz real</w:t>
+            </w:r>
+          </w:p>
+        </w:tc>
+      </w:tr>
+      <w:tr>
+        <w:tc>
+          <w:tcPr/>
+          <w:p>
+            <w:pPr>
+              <w:pStyle w:val="Compact"/>
+            </w:pPr>
+            <w:r>
+              <w:rPr>
+                <w:rStyle w:val="VerbatimChar"/>
+              </w:rPr>
+              <w:t xml:space="preserve">ui-designer</w:t>
+            </w:r>
+          </w:p>
+        </w:tc>
+        <w:tc>
+          <w:tcPr/>
+          <w:p>
+            <w:pPr>
+              <w:pStyle w:val="Compact"/>
+            </w:pPr>
+            <w:r>
+              <w:t xml:space="preserve">Traduce una especificación ya aprobada a interfaz real (hoy en React/TypeScript)</w:t>
+            </w:r>
+          </w:p>
+        </w:tc>
+        <w:tc>
+          <w:tcPr/>
+          <w:p>
+            <w:pPr>
+              <w:pStyle w:val="Compact"/>
+            </w:pPr>
+            <w:r>
+              <w:t xml:space="preserve">Solo puede escribir dentro de las rutas específicas que se le autorizan, nada fuera de eso</w:t>
+            </w:r>
+          </w:p>
+        </w:tc>
+      </w:tr>
+      <w:tr>
+        <w:tc>
+          <w:tcPr/>
+          <w:p>
+            <w:pPr>
+              <w:pStyle w:val="Compact"/>
+            </w:pPr>
+            <w:r>
+              <w:rPr>
+                <w:rStyle w:val="VerbatimChar"/>
+              </w:rPr>
+              <w:t xml:space="preserve">ux-critic</w:t>
+            </w:r>
+          </w:p>
+        </w:tc>
+        <w:tc>
+          <w:tcPr/>
+          <w:p>
+            <w:pPr>
+              <w:pStyle w:val="Compact"/>
+            </w:pPr>
+            <w:r>
+              <w:t xml:space="preserve">Revisa de forma independiente la calidad de UX de lo que producen</w:t>
+            </w:r>
+            <w:r>
+              <w:t xml:space="preserve"> </w:t>
+            </w:r>
+            <w:r>
+              <w:rPr>
+                <w:rStyle w:val="VerbatimChar"/>
+              </w:rPr>
+              <w:t xml:space="preserve">ux-designer</w:t>
+            </w:r>
+            <w:r>
+              <w:t xml:space="preserve"> </w:t>
+            </w:r>
+            <w:r>
+              <w:t xml:space="preserve">y</w:t>
+            </w:r>
+            <w:r>
+              <w:t xml:space="preserve"> </w:t>
+            </w:r>
+            <w:r>
+              <w:rPr>
+                <w:rStyle w:val="VerbatimChar"/>
+              </w:rPr>
+              <w:t xml:space="preserve">ui-designer</w:t>
+            </w:r>
+          </w:p>
+        </w:tc>
+        <w:tc>
+          <w:tcPr/>
+          <w:p>
+            <w:pPr>
+              <w:pStyle w:val="Compact"/>
+            </w:pPr>
+            <w:r>
+              <w:t xml:space="preserve">Solo lectura, clasifica hallazgos, nunca corrige directamente</w:t>
+            </w:r>
+          </w:p>
+        </w:tc>
+      </w:tr>
+      <w:tr>
+        <w:tc>
+          <w:tcPr/>
+          <w:p>
+            <w:pPr>
+              <w:pStyle w:val="Compact"/>
+            </w:pPr>
+            <w:r>
+              <w:rPr>
+                <w:rStyle w:val="VerbatimChar"/>
+              </w:rPr>
+              <w:t xml:space="preserve">reviewer</w:t>
+            </w:r>
+          </w:p>
+        </w:tc>
+        <w:tc>
+          <w:tcPr/>
+          <w:p>
+            <w:pPr>
+              <w:pStyle w:val="Compact"/>
+            </w:pPr>
+            <w:r>
+              <w:t xml:space="preserve">Revisa consistencia contra la Foundation (lenguaje, duplicación de responsabilidad, complejidad innecesaria)</w:t>
+            </w:r>
+          </w:p>
+        </w:tc>
+        <w:tc>
+          <w:tcPr/>
+          <w:p>
+            <w:pPr>
+              <w:pStyle w:val="Compact"/>
+            </w:pPr>
+            <w:r>
+              <w:t xml:space="preserve">Solo lectura, última revisión antes de dar algo por terminado</w:t>
+            </w:r>
+          </w:p>
+        </w:tc>
+      </w:tr>
+      <w:tr>
+        <w:tc>
+          <w:tcPr/>
+          <w:p>
+            <w:pPr>
+              <w:pStyle w:val="Compact"/>
+            </w:pPr>
+            <w:r>
+              <w:rPr>
+                <w:rStyle w:val="VerbatimChar"/>
+              </w:rPr>
+              <w:t xml:space="preserve">brand-guardian</w:t>
+            </w:r>
+          </w:p>
+        </w:tc>
+        <w:tc>
+          <w:tcPr/>
+          <w:p>
+            <w:pPr>
+              <w:pStyle w:val="Compact"/>
+            </w:pPr>
+            <w:r>
+              <w:t xml:space="preserve">Guardián de largo plazo de la identidad de Nahui (voz, tono, personalidad), dueño de la carpeta</w:t>
+            </w:r>
+            <w:r>
+              <w:t xml:space="preserve"> </w:t>
+            </w:r>
+            <w:r>
+              <w:rPr>
+                <w:rStyle w:val="VerbatimChar"/>
+              </w:rPr>
+              <w:t xml:space="preserve">/brand</w:t>
+            </w:r>
+          </w:p>
+        </w:tc>
+        <w:tc>
+          <w:tcPr/>
+          <w:p>
+            <w:pPr>
+              <w:pStyle w:val="Compact"/>
+            </w:pPr>
+            <w:r>
+              <w:t xml:space="preserve">Puede escribir dentro de</w:t>
+            </w:r>
+            <w:r>
+              <w:t xml:space="preserve"> </w:t>
+            </w:r>
+            <w:r>
+              <w:rPr>
+                <w:rStyle w:val="VerbatimChar"/>
+              </w:rPr>
+              <w:t xml:space="preserve">/brand</w:t>
+            </w:r>
+            <w:r>
+              <w:t xml:space="preserve">, revisa cualquier copy de cara al comerciante</w:t>
+            </w:r>
+          </w:p>
+        </w:tc>
+      </w:tr>
+      <w:tr>
+        <w:tc>
+          <w:tcPr/>
+          <w:p>
+            <w:pPr>
+              <w:pStyle w:val="Compact"/>
+            </w:pPr>
+            <w:r>
+              <w:rPr>
+                <w:rStyle w:val="VerbatimChar"/>
+              </w:rPr>
+              <w:t xml:space="preserve">marketing</w:t>
+            </w:r>
+          </w:p>
+        </w:tc>
+        <w:tc>
+          <w:tcPr/>
+          <w:p>
+            <w:pPr>
+              <w:pStyle w:val="Compact"/>
+            </w:pPr>
+            <w:r>
+              <w:t xml:space="preserve">Validación de mercado y preparación de salida al mercado</w:t>
+            </w:r>
+          </w:p>
+        </w:tc>
+        <w:tc>
+          <w:tcPr/>
+          <w:p>
+            <w:pPr>
+              <w:pStyle w:val="Compact"/>
+            </w:pPr>
+            <w:r>
+              <w:t xml:space="preserve">No puede publicar ni contactar a nadie externo sin mi aprobación explícita</w:t>
+            </w:r>
+          </w:p>
+        </w:tc>
+      </w:tr>
+      <w:tr>
+        <w:tc>
+          <w:tcPr/>
+          <w:p>
+            <w:pPr>
+              <w:pStyle w:val="Compact"/>
+            </w:pPr>
+            <w:r>
+              <w:rPr>
+                <w:rStyle w:val="VerbatimChar"/>
+              </w:rPr>
+              <w:t xml:space="preserve">knowledge-mentor</w:t>
+            </w:r>
+          </w:p>
+        </w:tc>
+        <w:tc>
+          <w:tcPr/>
+          <w:p>
+            <w:pPr>
+              <w:pStyle w:val="Compact"/>
+            </w:pPr>
+            <w:r>
+              <w:t xml:space="preserve">Capa de conocimiento compartido, consultada por otros agentes cuando necesitan evidencia externa o metodología</w:t>
+            </w:r>
+          </w:p>
+        </w:tc>
+        <w:tc>
+          <w:tcPr/>
+          <w:p>
+            <w:pPr>
+              <w:pStyle w:val="Compact"/>
+            </w:pPr>
+            <w:r>
+              <w:t xml:space="preserve">Nunca decide nada por sí sola, solo entrega evidencia etiquetada por su origen</w:t>
+            </w:r>
+          </w:p>
+        </w:tc>
+      </w:tr>
+      <w:tr>
+        <w:tc>
+          <w:tcPr/>
+          <w:p>
+            <w:pPr>
+              <w:pStyle w:val="Compact"/>
+            </w:pPr>
+            <w:r>
+              <w:rPr>
+                <w:rStyle w:val="VerbatimChar"/>
+              </w:rPr>
+              <w:t xml:space="preserve">merchant-user-tester</w:t>
+            </w:r>
+          </w:p>
+        </w:tc>
+        <w:tc>
+          <w:tcPr/>
+          <w:p>
+            <w:pPr>
+              <w:pStyle w:val="Compact"/>
+            </w:pPr>
+            <w:r>
+              <w:t xml:space="preserve">Camina el prototipo real como si fuera Ana, una comerciante usándolo por primera vez</w:t>
+            </w:r>
+          </w:p>
+        </w:tc>
+        <w:tc>
+          <w:tcPr/>
+          <w:p>
+            <w:pPr>
+              <w:pStyle w:val="Compact"/>
+            </w:pPr>
+            <w:r>
+              <w:t xml:space="preserve">No tiene acceso a leer ningún archivo del proyecto, solo puede navegar el producto ya construido. Este aislamiento es la parte más importante de su diseño, existe para que su reacción sea genuina y no una que ya sabe cómo se construyó todo por dentro</w:t>
+            </w:r>
+          </w:p>
+        </w:tc>
+      </w:tr>
+      <w:tr>
+        <w:tc>
+          <w:tcPr/>
+          <w:p>
+            <w:pPr>
+              <w:pStyle w:val="Compact"/>
+            </w:pPr>
+            <w:r>
+              <w:rPr>
+                <w:rStyle w:val="VerbatimChar"/>
+              </w:rPr>
+              <w:t xml:space="preserve">builder</w:t>
+            </w:r>
+          </w:p>
+        </w:tc>
+        <w:tc>
+          <w:tcPr/>
+          <w:p>
+            <w:pPr>
+              <w:pStyle w:val="Compact"/>
+            </w:pPr>
+            <w:r>
+              <w:t xml:space="preserve">Implementa código de producción una vez que algo pasa de prototipo a build real</w:t>
+            </w:r>
+          </w:p>
+        </w:tc>
+        <w:tc>
+          <w:tcPr/>
+          <w:p>
+            <w:pPr>
+              <w:pStyle w:val="Compact"/>
+            </w:pPr>
+            <w:r>
+              <w:t xml:space="preserve">Sin uso todavía, esta etapa del proyecto no ha llegado</w:t>
+            </w:r>
+          </w:p>
+        </w:tc>
+      </w:tr>
+    </w:tbl>
     <w:bookmarkEnd w:id="16"/>
+    <w:bookmarkStart w:id="17" w:name="Xdb846736018409aa0ec342d51fd606da216433f"/>
+    <w:p>
+      <w:pPr>
+        <w:pStyle w:val="Heading3"/>
+      </w:pPr>
+      <w:r>
+        <w:t xml:space="preserve">A.2 Los documentos que gobiernan el sistema</w:t>
+      </w:r>
+    </w:p>
+    <w:p>
+      <w:pPr>
+        <w:pStyle w:val="FirstParagraph"/>
+      </w:pPr>
+      <w:r>
+        <w:t xml:space="preserve">Cada carpeta principal del proyecto tiene su propio archivo</w:t>
+      </w:r>
+      <w:r>
+        <w:t xml:space="preserve"> </w:t>
+      </w:r>
+      <w:r>
+        <w:rPr>
+          <w:rStyle w:val="VerbatimChar"/>
+        </w:rPr>
+        <w:t xml:space="preserve">CLAUDE.md</w:t>
+      </w:r>
+      <w:r>
+        <w:t xml:space="preserve"> </w:t>
+      </w:r>
+      <w:r>
+        <w:t xml:space="preserve">que define las reglas de esa área específica, y ningún agente puede escribir fuera del área que le corresponde sin autorización explícita:</w:t>
+      </w:r>
+    </w:p>
+    <w:p>
+      <w:pPr>
+        <w:pStyle w:val="Compact"/>
+        <w:numPr>
+          <w:ilvl w:val="0"/>
+          <w:numId w:val="1002"/>
+        </w:numPr>
+      </w:pPr>
+      <w:r>
+        <w:rPr>
+          <w:rStyle w:val="VerbatimChar"/>
+        </w:rPr>
+        <w:t xml:space="preserve">company/CLAUDE.md</w:t>
+      </w:r>
+      <w:r>
+        <w:t xml:space="preserve">: quiénes somos, cómo opera el equipo de agentes, quién decide qué.</w:t>
+      </w:r>
+    </w:p>
+    <w:p>
+      <w:pPr>
+        <w:pStyle w:val="Compact"/>
+        <w:numPr>
+          <w:ilvl w:val="0"/>
+          <w:numId w:val="1002"/>
+        </w:numPr>
+      </w:pPr>
+      <w:r>
+        <w:rPr>
+          <w:rStyle w:val="VerbatimChar"/>
+        </w:rPr>
+        <w:t xml:space="preserve">product/00-foundation/CLAUDE.md</w:t>
+      </w:r>
+      <w:r>
+        <w:t xml:space="preserve">: el modelo de dominio congelado y los principios que no cambian sin pasar por un proceso formal.</w:t>
+      </w:r>
+    </w:p>
+    <w:p>
+      <w:pPr>
+        <w:pStyle w:val="Compact"/>
+        <w:numPr>
+          <w:ilvl w:val="0"/>
+          <w:numId w:val="1002"/>
+        </w:numPr>
+      </w:pPr>
+      <w:r>
+        <w:rPr>
+          <w:rStyle w:val="VerbatimChar"/>
+        </w:rPr>
+        <w:t xml:space="preserve">product/02-ux/CLAUDE.md</w:t>
+      </w:r>
+      <w:r>
+        <w:t xml:space="preserve">: las reglas de cómo se escriben las especificaciones de Baja Fidelidad.</w:t>
+      </w:r>
+    </w:p>
+    <w:p>
+      <w:pPr>
+        <w:pStyle w:val="Compact"/>
+        <w:numPr>
+          <w:ilvl w:val="0"/>
+          <w:numId w:val="1002"/>
+        </w:numPr>
+      </w:pPr>
+      <w:r>
+        <w:rPr>
+          <w:rStyle w:val="VerbatimChar"/>
+        </w:rPr>
+        <w:t xml:space="preserve">brand/CLAUDE.md</w:t>
+      </w:r>
+      <w:r>
+        <w:t xml:space="preserve">: la identidad de marca de largo plazo.</w:t>
+      </w:r>
+    </w:p>
+    <w:p>
+      <w:pPr>
+        <w:pStyle w:val="FirstParagraph"/>
+      </w:pPr>
+      <w:r>
+        <w:t xml:space="preserve">Esta separación no es solo organización de carpetas, es la forma concreta en la que</w:t>
+      </w:r>
+      <w:r>
+        <w:t xml:space="preserve"> </w:t>
+      </w:r>
+      <w:r>
+        <w:t xml:space="preserve">“quién decide qué”</w:t>
+      </w:r>
+      <w:r>
+        <w:t xml:space="preserve"> </w:t>
+      </w:r>
+      <w:r>
+        <w:t xml:space="preserve">deja de ser una frase bonita y se vuelve algo que un agente puede verificar antes de actuar.</w:t>
+      </w:r>
+    </w:p>
+    <w:bookmarkEnd w:id="17"/>
+    <w:bookmarkStart w:id="18" w:name="Xaa351fa038628add65a4d7cabfa59197fade2f7"/>
+    <w:p>
+      <w:pPr>
+        <w:pStyle w:val="Heading3"/>
+      </w:pPr>
+      <w:r>
+        <w:t xml:space="preserve">A.3 Cuándo migré partes de la gobernanza a Skills, y por qué</w:t>
+      </w:r>
+    </w:p>
+    <w:p>
+      <w:pPr>
+        <w:pStyle w:val="FirstParagraph"/>
+      </w:pPr>
+      <w:r>
+        <w:t xml:space="preserve">Al principio, cada vez que despachaba una tarea a un agente, ese agente releía documentos completos de la Foundation, aunque solo dos o tres decisiones específicas le importaran a esa tarea. Solo el registro de decisiones del producto pesa cerca de 18,800 tokens, y se leía completo en cada despacho de varios agentes distintos. Además, yo misma retecleaba la misma metodología dentro de las instrucciones que le daba a</w:t>
+      </w:r>
+      <w:r>
+        <w:t xml:space="preserve"> </w:t>
+      </w:r>
+      <w:r>
+        <w:rPr>
+          <w:rStyle w:val="VerbatimChar"/>
+        </w:rPr>
+        <w:t xml:space="preserve">ui-designer</w:t>
+      </w:r>
+      <w:r>
+        <w:t xml:space="preserve"> </w:t>
+      </w:r>
+      <w:r>
+        <w:t xml:space="preserve">una y otra vez, por ejemplo, la prueba para decidir si un elemento de diseño se debe clonar o compartir entre pantallas.</w:t>
+      </w:r>
+    </w:p>
+    <w:p>
+      <w:pPr>
+        <w:pStyle w:val="BodyText"/>
+      </w:pPr>
+      <w:r>
+        <w:t xml:space="preserve">La solución fue separar lo que era juicio real de lo que era procedimiento repetible. El juicio se queda en el agente. El procedimiento se movió a Skills, instrucciones reutilizables que cualquier agente puede cargar por nombre en vez de que yo se lo repita cada vez. El agente</w:t>
+      </w:r>
+      <w:r>
+        <w:t xml:space="preserve"> </w:t>
+      </w:r>
+      <w:r>
+        <w:rPr>
+          <w:rStyle w:val="VerbatimChar"/>
+        </w:rPr>
+        <w:t xml:space="preserve">planner</w:t>
+      </w:r>
+      <w:r>
+        <w:t xml:space="preserve">, que nunca llegué a usar en la práctica, se retiró por completo y se reemplazó con una Skill de priorización de backlog que aplico directamente. Esto redujo el consumo de tokens de forma medible en cada despacho, sin quitarle a ningún agente su capacidad real de decidir.</w:t>
+      </w:r>
+    </w:p>
+    <w:bookmarkEnd w:id="18"/>
+    <w:bookmarkStart w:id="19" w:name="Xb834cd0d95350f98be29d5ff6854109458c31ee"/>
+    <w:p>
+      <w:pPr>
+        <w:pStyle w:val="Heading3"/>
+      </w:pPr>
+      <w:r>
+        <w:t xml:space="preserve">A.4 Cuándo le di a Main autoridad para hacer push sin pedirme permiso</w:t>
+      </w:r>
+    </w:p>
+    <w:p>
+      <w:pPr>
+        <w:pStyle w:val="FirstParagraph"/>
+      </w:pPr>
+      <w:r>
+        <w:t xml:space="preserve">Al principio, cada commit y cada push los aprobaba yo directamente, uno por uno. El 2026-08-08 di la instrucción de que Main puede hacer commit y push por su cuenta cuando un bloque de trabajo coherente ya está terminado y revisado, sin pedirme permiso cada vez. Esto se extendió después a que Main siga trabajando mientras yo duermo o no estoy disponible, siempre que no haya una decisión real de negocio, arquitectura o producto pendiente de mi parte.</w:t>
+      </w:r>
+    </w:p>
+    <w:p>
+      <w:pPr>
+        <w:pStyle w:val="BodyText"/>
+      </w:pPr>
+      <w:r>
+        <w:t xml:space="preserve">Esta autoridad tiene un límite explícito que nunca se cruza: cualquier operación destructiva (forzar un push, reescribir historial, borrar una rama) requiere mi aprobación directa, sin excepción. La autonomía cubre el trabajo rutinario ya revisado, nunca las decisiones que de verdad importan.</w:t>
+      </w:r>
+    </w:p>
+    <w:bookmarkEnd w:id="19"/>
+    <w:bookmarkEnd w:id="20"/>
+    <w:bookmarkEnd w:id="21"/>
     <w:sectPr>
       <w:footnotePr>
         <w:numRestart w:val="eachSect"/>
@@ -2163,6 +2865,9 @@
     <w:abstractNumId w:val="990"/>
   </w:num>
   <w:num w:numId="1001">
+    <w:abstractNumId w:val="991"/>
+  </w:num>
+  <w:num w:numId="1002">
     <w:abstractNumId w:val="991"/>
   </w:num>
 </w:numbering>

</xml_diff>

<commit_message>
docs(evidence): embed real diagrams into Demo Day annex
Added Anexo B with four real screenshots (agent roster, document
governance flow, validation cycle, causal timeline through today),
matching the visual-appendix format of the author's own prior
submission (A01451839_ACTDemo.pdf) rather than a text-only annex.
Rendered from a locally-served HTML page (Nahui brand tokens: Coral
AA+, Fredoka/Inter) since claude.ai artifact URLs require an
authenticated session automated browsing doesn't have.
</commit_message>
<xml_diff>
--- a/evidence/2026-08-22-demo-day/Nahui - Documento Ejecutivo Demo Day.docx
+++ b/evidence/2026-08-22-demo-day/Nahui - Documento Ejecutivo Demo Day.docx
@@ -2,7 +2,7 @@
 <file path=word/document.xml><?xml version="1.0" encoding="utf-8"?>
 <w:document xmlns:w="http://schemas.openxmlformats.org/wordprocessingml/2006/main" xmlns:m="http://schemas.openxmlformats.org/officeDocument/2006/math" xmlns:r="http://schemas.openxmlformats.org/officeDocument/2006/relationships" xmlns:o="urn:schemas-microsoft-com:office:office" xmlns:v="urn:schemas-microsoft-com:vml" xmlns:w10="urn:schemas-microsoft-com:office:word" xmlns:a="http://schemas.openxmlformats.org/drawingml/2006/main" xmlns:pic="http://schemas.openxmlformats.org/drawingml/2006/picture" xmlns:wp="http://schemas.openxmlformats.org/drawingml/2006/wordprocessingDrawing">
   <w:body>
-    <w:bookmarkStart w:id="21" w:name="nahui-documento-ejecutivo-demo-day"/>
+    <w:bookmarkStart w:id="34" w:name="nahui-documento-ejecutivo-demo-day"/>
     <w:p>
       <w:pPr>
         <w:pStyle w:val="Heading1"/>
@@ -2645,9 +2645,266 @@
         <w:t xml:space="preserve">Esta autoridad tiene un límite explícito que nunca se cruza: cualquier operación destructiva (forzar un push, reescribir historial, borrar una rama) requiere mi aprobación directa, sin excepción. La autonomía cubre el trabajo rutinario ya revisado, nunca las decisiones que de verdad importan.</w:t>
       </w:r>
     </w:p>
+    <w:p>
+      <w:r>
+        <w:pict>
+          <v:rect style="width:0;height:1.5pt" o:hralign="center" o:hrstd="t" o:hr="t"/>
+        </w:pict>
+      </w:r>
+    </w:p>
     <w:bookmarkEnd w:id="19"/>
     <w:bookmarkEnd w:id="20"/>
-    <w:bookmarkEnd w:id="21"/>
+    <w:bookmarkStart w:id="33" w:name="Xcbbf8a2b96aa8c272121ea2cc76d90ad916722f"/>
+    <w:p>
+      <w:pPr>
+        <w:pStyle w:val="Heading2"/>
+      </w:pPr>
+      <w:r>
+        <w:t xml:space="preserve">Anexo B: evidencia visual de la arquitectura</w:t>
+      </w:r>
+    </w:p>
+    <w:p>
+      <w:pPr>
+        <w:pStyle w:val="FirstParagraph"/>
+      </w:pPr>
+      <w:r>
+        <w:rPr>
+          <w:i/>
+          <w:iCs/>
+        </w:rPr>
+        <w:t xml:space="preserve">(Anexo, no cuenta contra el límite de 7 páginas.)</w:t>
+      </w:r>
+    </w:p>
+    <w:p>
+      <w:pPr>
+        <w:pStyle w:val="BodyText"/>
+      </w:pPr>
+      <w:r>
+        <w:t xml:space="preserve">Cada diagrama respalda algo dicho en el Anexo A. Es evidencia, no lectura adicional.</w:t>
+      </w:r>
+    </w:p>
+    <w:p>
+      <w:pPr>
+        <w:pStyle w:val="CaptionedFigure"/>
+      </w:pPr>
+      <w:r>
+        <w:drawing>
+          <wp:inline>
+            <wp:extent cx="5334000" cy="1630480"/>
+            <wp:effectExtent b="0" l="0" r="0" t="0"/>
+            <wp:docPr descr="Roster de agentes especializados" title="" id="22" name="Picture"/>
+            <a:graphic>
+              <a:graphicData uri="http://schemas.openxmlformats.org/drawingml/2006/picture">
+                <pic:pic>
+                  <pic:nvPicPr>
+                    <pic:cNvPr descr="images/anexo-1-agentes.png" id="23" name="Picture"/>
+                    <pic:cNvPicPr>
+                      <a:picLocks noChangeArrowheads="1" noChangeAspect="1"/>
+                    </pic:cNvPicPr>
+                  </pic:nvPicPr>
+                  <pic:blipFill>
+                    <a:blip r:embed="rId21"/>
+                    <a:stretch>
+                      <a:fillRect/>
+                    </a:stretch>
+                  </pic:blipFill>
+                  <pic:spPr bwMode="auto">
+                    <a:xfrm>
+                      <a:off x="0" y="0"/>
+                      <a:ext cx="5334000" cy="1630480"/>
+                    </a:xfrm>
+                    <a:prstGeom prst="rect">
+                      <a:avLst/>
+                    </a:prstGeom>
+                    <a:noFill/>
+                    <a:ln w="9525">
+                      <a:noFill/>
+                      <a:headEnd/>
+                      <a:tailEnd/>
+                    </a:ln>
+                  </pic:spPr>
+                </pic:pic>
+              </a:graphicData>
+            </a:graphic>
+          </wp:inline>
+        </w:drawing>
+      </w:r>
+    </w:p>
+    <w:p>
+      <w:pPr>
+        <w:pStyle w:val="ImageCaption"/>
+      </w:pPr>
+      <w:r>
+        <w:t xml:space="preserve">Roster de agentes especializados</w:t>
+      </w:r>
+    </w:p>
+    <w:p>
+      <w:pPr>
+        <w:pStyle w:val="CaptionedFigure"/>
+      </w:pPr>
+      <w:r>
+        <w:drawing>
+          <wp:inline>
+            <wp:extent cx="5334000" cy="978288"/>
+            <wp:effectExtent b="0" l="0" r="0" t="0"/>
+            <wp:docPr descr="Cómo se relacionan los documentos que gobiernan el proyecto" title="" id="25" name="Picture"/>
+            <a:graphic>
+              <a:graphicData uri="http://schemas.openxmlformats.org/drawingml/2006/picture">
+                <pic:pic>
+                  <pic:nvPicPr>
+                    <pic:cNvPr descr="images/anexo-2-documentos.png" id="26" name="Picture"/>
+                    <pic:cNvPicPr>
+                      <a:picLocks noChangeArrowheads="1" noChangeAspect="1"/>
+                    </pic:cNvPicPr>
+                  </pic:nvPicPr>
+                  <pic:blipFill>
+                    <a:blip r:embed="rId24"/>
+                    <a:stretch>
+                      <a:fillRect/>
+                    </a:stretch>
+                  </pic:blipFill>
+                  <pic:spPr bwMode="auto">
+                    <a:xfrm>
+                      <a:off x="0" y="0"/>
+                      <a:ext cx="5334000" cy="978288"/>
+                    </a:xfrm>
+                    <a:prstGeom prst="rect">
+                      <a:avLst/>
+                    </a:prstGeom>
+                    <a:noFill/>
+                    <a:ln w="9525">
+                      <a:noFill/>
+                      <a:headEnd/>
+                      <a:tailEnd/>
+                    </a:ln>
+                  </pic:spPr>
+                </pic:pic>
+              </a:graphicData>
+            </a:graphic>
+          </wp:inline>
+        </w:drawing>
+      </w:r>
+    </w:p>
+    <w:p>
+      <w:pPr>
+        <w:pStyle w:val="ImageCaption"/>
+      </w:pPr>
+      <w:r>
+        <w:t xml:space="preserve">Cómo se relacionan los documentos que gobiernan el proyecto</w:t>
+      </w:r>
+    </w:p>
+    <w:p>
+      <w:pPr>
+        <w:pStyle w:val="CaptionedFigure"/>
+      </w:pPr>
+      <w:r>
+        <w:drawing>
+          <wp:inline>
+            <wp:extent cx="5334000" cy="1222860"/>
+            <wp:effectExtent b="0" l="0" r="0" t="0"/>
+            <wp:docPr descr="El ciclo de validación" title="" id="28" name="Picture"/>
+            <a:graphic>
+              <a:graphicData uri="http://schemas.openxmlformats.org/drawingml/2006/picture">
+                <pic:pic>
+                  <pic:nvPicPr>
+                    <pic:cNvPr descr="images/anexo-3-ciclo.png" id="29" name="Picture"/>
+                    <pic:cNvPicPr>
+                      <a:picLocks noChangeArrowheads="1" noChangeAspect="1"/>
+                    </pic:cNvPicPr>
+                  </pic:nvPicPr>
+                  <pic:blipFill>
+                    <a:blip r:embed="rId27"/>
+                    <a:stretch>
+                      <a:fillRect/>
+                    </a:stretch>
+                  </pic:blipFill>
+                  <pic:spPr bwMode="auto">
+                    <a:xfrm>
+                      <a:off x="0" y="0"/>
+                      <a:ext cx="5334000" cy="1222860"/>
+                    </a:xfrm>
+                    <a:prstGeom prst="rect">
+                      <a:avLst/>
+                    </a:prstGeom>
+                    <a:noFill/>
+                    <a:ln w="9525">
+                      <a:noFill/>
+                      <a:headEnd/>
+                      <a:tailEnd/>
+                    </a:ln>
+                  </pic:spPr>
+                </pic:pic>
+              </a:graphicData>
+            </a:graphic>
+          </wp:inline>
+        </w:drawing>
+      </w:r>
+    </w:p>
+    <w:p>
+      <w:pPr>
+        <w:pStyle w:val="ImageCaption"/>
+      </w:pPr>
+      <w:r>
+        <w:t xml:space="preserve">El ciclo de validación</w:t>
+      </w:r>
+    </w:p>
+    <w:p>
+      <w:pPr>
+        <w:pStyle w:val="CaptionedFigure"/>
+      </w:pPr>
+      <w:r>
+        <w:drawing>
+          <wp:inline>
+            <wp:extent cx="5334000" cy="1548956"/>
+            <wp:effectExtent b="0" l="0" r="0" t="0"/>
+            <wp:docPr descr="Causa y efecto a lo largo del proyecto" title="" id="31" name="Picture"/>
+            <a:graphic>
+              <a:graphicData uri="http://schemas.openxmlformats.org/drawingml/2006/picture">
+                <pic:pic>
+                  <pic:nvPicPr>
+                    <pic:cNvPr descr="images/anexo-4-timeline.png" id="32" name="Picture"/>
+                    <pic:cNvPicPr>
+                      <a:picLocks noChangeArrowheads="1" noChangeAspect="1"/>
+                    </pic:cNvPicPr>
+                  </pic:nvPicPr>
+                  <pic:blipFill>
+                    <a:blip r:embed="rId30"/>
+                    <a:stretch>
+                      <a:fillRect/>
+                    </a:stretch>
+                  </pic:blipFill>
+                  <pic:spPr bwMode="auto">
+                    <a:xfrm>
+                      <a:off x="0" y="0"/>
+                      <a:ext cx="5334000" cy="1548956"/>
+                    </a:xfrm>
+                    <a:prstGeom prst="rect">
+                      <a:avLst/>
+                    </a:prstGeom>
+                    <a:noFill/>
+                    <a:ln w="9525">
+                      <a:noFill/>
+                      <a:headEnd/>
+                      <a:tailEnd/>
+                    </a:ln>
+                  </pic:spPr>
+                </pic:pic>
+              </a:graphicData>
+            </a:graphic>
+          </wp:inline>
+        </w:drawing>
+      </w:r>
+    </w:p>
+    <w:p>
+      <w:pPr>
+        <w:pStyle w:val="ImageCaption"/>
+      </w:pPr>
+      <w:r>
+        <w:t xml:space="preserve">Causa y efecto a lo largo del proyecto</w:t>
+      </w:r>
+    </w:p>
+    <w:bookmarkEnd w:id="33"/>
+    <w:bookmarkEnd w:id="34"/>
     <w:sectPr>
       <w:footnotePr>
         <w:numRestart w:val="eachSect"/>

</xml_diff>

<commit_message>
fix(evidence): actually apply Nahui brand fonts/color to the Word doc
Previous commit only styled the four embedded diagram images, not the
document's own text, headers, and tables, despite my claim that it did.
Fredoka and Inter weren't even installed on this machine, so Word was
silently substituting fallbacks regardless of style names used.

Installed both fonts for real (google/fonts repo), built a pandoc
reference-doc.docx with Heading 1/2 set to Fredoka/Coral AA+ (#C13F26)
and Normal set to Inter, and verified via python-docx that the full
style inheritance chain (headings, body paragraphs, and table cells)
actually resolves to these values in the generated file, not just
the template definition.
</commit_message>
<xml_diff>
--- a/evidence/2026-08-22-demo-day/Nahui - Documento Ejecutivo Demo Day.docx
+++ b/evidence/2026-08-22-demo-day/Nahui - Documento Ejecutivo Demo Day.docx
@@ -3151,6 +3151,11 @@
   <w:style w:default="1" w:styleId="Normal" w:type="paragraph">
     <w:name w:val="Normal"/>
     <w:qFormat/>
+    <w:rPr>
+      <w:rFonts w:ascii="Inter" w:cs="Inter" w:hAnsi="Inter"/>
+      <w:color w:val="141413"/>
+      <w:sz w:val="22"/>
+    </w:rPr>
   </w:style>
   <w:style w:styleId="BodyText" w:type="paragraph">
     <w:name w:val="Body Text"/>
@@ -3189,8 +3194,10 @@
       <w:jc w:val="center"/>
     </w:pPr>
     <w:rPr>
-      <w:rFonts w:asciiTheme="majorHAnsi" w:cstheme="majorBidi" w:eastAsiaTheme="majorEastAsia" w:hAnsiTheme="majorHAnsi"/>
-      <w:sz w:val="56"/>
+      <w:rFonts w:ascii="Fredoka" w:asciiTheme="majorHAnsi" w:cs="Fredoka" w:cstheme="majorBidi" w:eastAsiaTheme="majorEastAsia" w:hAnsi="Fredoka" w:hAnsiTheme="majorHAnsi"/>
+      <w:b/>
+      <w:color w:val="C13F26"/>
+      <w:sz w:val="52"/>
       <w:szCs w:val="56"/>
     </w:rPr>
   </w:style>
@@ -3323,9 +3330,10 @@
       <w:outlineLvl w:val="0"/>
     </w:pPr>
     <w:rPr>
-      <w:rFonts w:asciiTheme="majorHAnsi" w:cstheme="majorBidi" w:eastAsiaTheme="majorEastAsia" w:hAnsiTheme="majorHAnsi"/>
-      <w:color w:themeColor="accent1" w:themeShade="BF" w:val="0F4761"/>
-      <w:sz w:val="40"/>
+      <w:rFonts w:ascii="Fredoka" w:asciiTheme="majorHAnsi" w:cs="Fredoka" w:cstheme="majorBidi" w:eastAsiaTheme="majorEastAsia" w:hAnsi="Fredoka" w:hAnsiTheme="majorHAnsi"/>
+      <w:b/>
+      <w:color w:val="C13F26"/>
+      <w:sz w:val="32"/>
       <w:szCs w:val="40"/>
     </w:rPr>
   </w:style>
@@ -3346,9 +3354,10 @@
       <w:outlineLvl w:val="1"/>
     </w:pPr>
     <w:rPr>
-      <w:rFonts w:asciiTheme="majorHAnsi" w:cstheme="majorBidi" w:eastAsiaTheme="majorEastAsia" w:hAnsiTheme="majorHAnsi"/>
-      <w:color w:themeColor="accent1" w:themeShade="BF" w:val="0F4761"/>
-      <w:sz w:val="32"/>
+      <w:rFonts w:ascii="Fredoka" w:asciiTheme="majorHAnsi" w:cs="Fredoka" w:cstheme="majorBidi" w:eastAsiaTheme="majorEastAsia" w:hAnsi="Fredoka" w:hAnsiTheme="majorHAnsi"/>
+      <w:b/>
+      <w:color w:val="C13F26"/>
+      <w:sz w:val="26"/>
       <w:szCs w:val="32"/>
     </w:rPr>
   </w:style>
@@ -3369,9 +3378,10 @@
       <w:outlineLvl w:val="2"/>
     </w:pPr>
     <w:rPr>
-      <w:rFonts w:cstheme="majorBidi" w:eastAsiaTheme="majorEastAsia"/>
-      <w:color w:themeColor="accent1" w:themeShade="BF" w:val="0F4761"/>
-      <w:sz w:val="28"/>
+      <w:rFonts w:ascii="Fredoka" w:cs="Fredoka" w:cstheme="majorBidi" w:eastAsiaTheme="majorEastAsia" w:hAnsi="Fredoka"/>
+      <w:b/>
+      <w:color w:val="141413"/>
+      <w:sz w:val="23"/>
       <w:szCs w:val="28"/>
     </w:rPr>
   </w:style>

</xml_diff>

<commit_message>
fix(evidence): clarify timeline label, principle adopted not achieved
"Se gana el derecho de aconsejar" read as if Nahui had already earned
advisory trust with real users, which isn't true, the app has no
confirmed real users yet. Relabeled to make clear this milestone is
that the rule got written down for future behavior, not that it was
accomplished.
</commit_message>
<xml_diff>
--- a/evidence/2026-08-22-demo-day/Nahui - Documento Ejecutivo Demo Day.docx
+++ b/evidence/2026-08-22-demo-day/Nahui - Documento Ejecutivo Demo Day.docx
@@ -2855,7 +2855,7 @@
       <w:r>
         <w:drawing>
           <wp:inline>
-            <wp:extent cx="5334000" cy="1548956"/>
+            <wp:extent cx="5334000" cy="1694534"/>
             <wp:effectExtent b="0" l="0" r="0" t="0"/>
             <wp:docPr descr="Causa y efecto a lo largo del proyecto" title="" id="31" name="Picture"/>
             <a:graphic>
@@ -2876,7 +2876,7 @@
                   <pic:spPr bwMode="auto">
                     <a:xfrm>
                       <a:off x="0" y="0"/>
-                      <a:ext cx="5334000" cy="1548956"/>
+                      <a:ext cx="5334000" cy="1694534"/>
                     </a:xfrm>
                     <a:prstGeom prst="rect">
                       <a:avLst/>

</xml_diff>

<commit_message>
docs(evidence): rewrite Section 6 to match S7 rubric exactly
Sesión 7 (Plan de Despliegue) specifies three required tables (Mapa
de impacto en personas, Capacitación y comunicación, Hoja de ruta con
responsable nombrado), not free prose. Rewrote the section against
that exact format with three real roles (Ana, the founder, future
pilot merchants), grounded in what's actually been built or decided,
being explicit about what's still pending rather than implying it's
done. Deadline confirmed: Monday Aug 24, 8:00 a.m.
</commit_message>
<xml_diff>
--- a/evidence/2026-08-22-demo-day/Nahui - Documento Ejecutivo Demo Day.docx
+++ b/evidence/2026-08-22-demo-day/Nahui - Documento Ejecutivo Demo Day.docx
@@ -1478,73 +1478,13 @@
           <w:b/>
           <w:bCs/>
         </w:rPr>
-        <w:t xml:space="preserve">A quién le cambia el trabajo:</w:t>
-      </w:r>
-      <w:r>
-        <w:t xml:space="preserve"> </w:t>
-      </w:r>
-      <w:r>
-        <w:t xml:space="preserve">Nahui no se despliega dentro de una empresa con empleados existentes que puedan ver su puesto amenazado. El cambio real de trabajo es el mío, de operar sola a dirigir un equipo de agentes de IA especializados, cada uno con autoridad real y no solo instrucciones. Para Ana y futuras comerciantes piloto, el trabajo no se reemplaza, cambia en que el registro deja de competir con atender al cliente.</w:t>
-      </w:r>
-    </w:p>
-    <w:p>
-      <w:pPr>
-        <w:pStyle w:val="BodyText"/>
-      </w:pPr>
-      <w:r>
-        <w:rPr>
-          <w:b/>
-          <w:bCs/>
-        </w:rPr>
-        <w:t xml:space="preserve">A quién podría ver esto como amenaza:</w:t>
-      </w:r>
-      <w:r>
-        <w:t xml:space="preserve"> </w:t>
-      </w:r>
-      <w:r>
-        <w:t xml:space="preserve">Ana ya me dijo, en otra conversación, que no quiere que la metan a plataformas tipo Amazon o Mercado Pago por las comisiones que cobran. Nahui explícitamente no cobra comisión por transacción, decisión de diseño ya tomada, justo para no replicar ese modelo de intermediario.</w:t>
-      </w:r>
-    </w:p>
-    <w:p>
-      <w:pPr>
-        <w:pStyle w:val="BodyText"/>
-      </w:pPr>
-      <w:r>
-        <w:rPr>
-          <w:b/>
-          <w:bCs/>
-        </w:rPr>
-        <w:t xml:space="preserve">Capacitación:</w:t>
-      </w:r>
-      <w:r>
-        <w:t xml:space="preserve"> </w:t>
-      </w:r>
-      <w:r>
-        <w:t xml:space="preserve">una pantalla de bienvenida (ya construida,</w:t>
-      </w:r>
-      <w:r>
-        <w:t xml:space="preserve"> </w:t>
-      </w:r>
-      <w:r>
-        <w:rPr>
-          <w:rStyle w:val="VerbatimChar"/>
-        </w:rPr>
-        <w:t xml:space="preserve">demo-mode.md</w:t>
-      </w:r>
-      <w:r>
-        <w:t xml:space="preserve">) que le dice a la comerciante piloto qué es real y qué no antes de que toque nada. No un manual largo, una orientación de menos de 15 segundos.</w:t>
-      </w:r>
-    </w:p>
-    <w:p>
-      <w:pPr>
-        <w:pStyle w:val="BodyText"/>
-      </w:pPr>
-      <w:r>
-        <w:rPr>
-          <w:b/>
-          <w:bCs/>
-        </w:rPr>
-        <w:t xml:space="preserve">Primeros hitos:</w:t>
+        <w:t xml:space="preserve">Mapa de impacto en personas.</w:t>
+      </w:r>
+      <w:r>
+        <w:t xml:space="preserve"> </w:t>
+      </w:r>
+      <w:r>
+        <w:t xml:space="preserve">Nahui no se despliega dentro de una empresa con empleados existentes cuyo puesto quede amenazado. Los tres roles reales a quienes les cambia el trabajo:</w:t>
       </w:r>
     </w:p>
     <w:tbl>
@@ -1570,29 +1510,29 @@
               <w:pStyle w:val="Compact"/>
             </w:pPr>
             <w:r>
-              <w:t xml:space="preserve">Hito</w:t>
-            </w:r>
-          </w:p>
-        </w:tc>
-        <w:tc>
-          <w:tcPr/>
-          <w:p>
-            <w:pPr>
-              <w:pStyle w:val="Compact"/>
-            </w:pPr>
-            <w:r>
-              <w:t xml:space="preserve">Responsable</w:t>
-            </w:r>
-          </w:p>
-        </w:tc>
-        <w:tc>
-          <w:tcPr/>
-          <w:p>
-            <w:pPr>
-              <w:pStyle w:val="Compact"/>
-            </w:pPr>
-            <w:r>
-              <w:t xml:space="preserve">Fecha</w:t>
+              <w:t xml:space="preserve">Rol</w:t>
+            </w:r>
+          </w:p>
+        </w:tc>
+        <w:tc>
+          <w:tcPr/>
+          <w:p>
+            <w:pPr>
+              <w:pStyle w:val="Compact"/>
+            </w:pPr>
+            <w:r>
+              <w:t xml:space="preserve">Qué gana</w:t>
+            </w:r>
+          </w:p>
+        </w:tc>
+        <w:tc>
+          <w:tcPr/>
+          <w:p>
+            <w:pPr>
+              <w:pStyle w:val="Compact"/>
+            </w:pPr>
+            <w:r>
+              <w:t xml:space="preserve">Qué teme</w:t>
             </w:r>
           </w:p>
         </w:tc>
@@ -1605,29 +1545,29 @@
               <w:pStyle w:val="Compact"/>
             </w:pPr>
             <w:r>
-              <w:t xml:space="preserve">Piloto Concierge/DM, diagnosticar causa real de no adopción</w:t>
-            </w:r>
-          </w:p>
-        </w:tc>
-        <w:tc>
-          <w:tcPr/>
-          <w:p>
-            <w:pPr>
-              <w:pStyle w:val="Compact"/>
-            </w:pPr>
-            <w:r>
-              <w:t xml:space="preserve">Claudia Falcón, Fundadora / Product Owner</w:t>
-            </w:r>
-          </w:p>
-        </w:tc>
-        <w:tc>
-          <w:tcPr/>
-          <w:p>
-            <w:pPr>
-              <w:pStyle w:val="Compact"/>
-            </w:pPr>
-            <w:r>
-              <w:t xml:space="preserve">Próximas 2 semanas</w:t>
+              <w:t xml:space="preserve">Ana (comerciante piloto)</w:t>
+            </w:r>
+          </w:p>
+        </w:tc>
+        <w:tc>
+          <w:tcPr/>
+          <w:p>
+            <w:pPr>
+              <w:pStyle w:val="Compact"/>
+            </w:pPr>
+            <w:r>
+              <w:t xml:space="preserve">No pierde el registro de una venta aunque llegue el siguiente cliente sin avisar</w:t>
+            </w:r>
+          </w:p>
+        </w:tc>
+        <w:tc>
+          <w:tcPr/>
+          <w:p>
+            <w:pPr>
+              <w:pStyle w:val="Compact"/>
+            </w:pPr>
+            <w:r>
+              <w:t xml:space="preserve">Que la tecnología le falle o se complique justo en el momento de vender, cuando no tiene margen para resolver un problema técnico</w:t>
             </w:r>
           </w:p>
         </w:tc>
@@ -1640,29 +1580,29 @@
               <w:pStyle w:val="Compact"/>
             </w:pPr>
             <w:r>
-              <w:t xml:space="preserve">Decisión de precio (Business Decision)</w:t>
-            </w:r>
-          </w:p>
-        </w:tc>
-        <w:tc>
-          <w:tcPr/>
-          <w:p>
-            <w:pPr>
-              <w:pStyle w:val="Compact"/>
-            </w:pPr>
-            <w:r>
-              <w:t xml:space="preserve">Claudia Falcón, Fundadora / Product Owner</w:t>
-            </w:r>
-          </w:p>
-        </w:tc>
-        <w:tc>
-          <w:tcPr/>
-          <w:p>
-            <w:pPr>
-              <w:pStyle w:val="Compact"/>
-            </w:pPr>
-            <w:r>
-              <w:t xml:space="preserve">Antes de la siguiente ola de adquisición</w:t>
+              <w:t xml:space="preserve">Yo (fundadora)</w:t>
+            </w:r>
+          </w:p>
+        </w:tc>
+        <w:tc>
+          <w:tcPr/>
+          <w:p>
+            <w:pPr>
+              <w:pStyle w:val="Compact"/>
+            </w:pPr>
+            <w:r>
+              <w:t xml:space="preserve">Dirijo un equipo completo de diseño, arquitectura, marketing y validación sin ser experta en cada área</w:t>
+            </w:r>
+          </w:p>
+        </w:tc>
+        <w:tc>
+          <w:tcPr/>
+          <w:p>
+            <w:pPr>
+              <w:pStyle w:val="Compact"/>
+            </w:pPr>
+            <w:r>
+              <w:t xml:space="preserve">Perder visibilidad de una decisión real si delego de más, o que un agente actúe fuera de su autoridad sin que yo me entere (esto es justo lo que la gobernanza del Anexo A existe para prevenir)</w:t>
             </w:r>
           </w:p>
         </w:tc>
@@ -1675,18 +1615,374 @@
               <w:pStyle w:val="Compact"/>
             </w:pPr>
             <w:r>
-              <w:t xml:space="preserve">Resolución de la solución técnica NFC</w:t>
-            </w:r>
-          </w:p>
-        </w:tc>
-        <w:tc>
-          <w:tcPr/>
-          <w:p>
-            <w:pPr>
-              <w:pStyle w:val="Compact"/>
-            </w:pPr>
-            <w:r>
-              <w:t xml:space="preserve">Agente</w:t>
+              <w:t xml:space="preserve">Futuras comerciantes piloto</w:t>
+            </w:r>
+          </w:p>
+        </w:tc>
+        <w:tc>
+          <w:tcPr/>
+          <w:p>
+            <w:pPr>
+              <w:pStyle w:val="Compact"/>
+            </w:pPr>
+            <w:r>
+              <w:t xml:space="preserve">Acceso gratuito a inteligencia de negocio real, sin comisión por transacción (Ana ya me dijo, en otra conversación, que no quiere que la metan a plataformas tipo Amazon o Mercado Pago por las comisiones que cobran)</w:t>
+            </w:r>
+          </w:p>
+        </w:tc>
+        <w:tc>
+          <w:tcPr/>
+          <w:p>
+            <w:pPr>
+              <w:pStyle w:val="Compact"/>
+            </w:pPr>
+            <w:r>
+              <w:t xml:space="preserve">Que sus datos de venta o de sus clientes queden expuestos, o que la app no calce con su tipo específico de bazar o tianguis</w:t>
+            </w:r>
+          </w:p>
+        </w:tc>
+      </w:tr>
+    </w:tbl>
+    <w:p>
+      <w:pPr>
+        <w:pStyle w:val="BodyText"/>
+      </w:pPr>
+      <w:r>
+        <w:rPr>
+          <w:b/>
+          <w:bCs/>
+        </w:rPr>
+        <w:t xml:space="preserve">Capacitación y comunicación:</w:t>
+      </w:r>
+    </w:p>
+    <w:tbl>
+      <w:tblPr>
+        <w:tblStyle w:val="Table"/>
+        <w:tblW w:type="pct" w:w="5000"/>
+        <w:tblLayout w:type="fixed"/>
+        <w:tblLook w:firstRow="1" w:lastRow="0" w:firstColumn="0" w:lastColumn="0" w:noHBand="0" w:noVBand="0" w:val="0020"/>
+      </w:tblPr>
+      <w:tblGrid>
+        <w:gridCol w:w="2640"/>
+        <w:gridCol w:w="2640"/>
+        <w:gridCol w:w="2640"/>
+      </w:tblGrid>
+      <w:tr>
+        <w:trPr>
+          <w:tblHeader w:val="on"/>
+        </w:trPr>
+        <w:tc>
+          <w:tcPr/>
+          <w:p>
+            <w:pPr>
+              <w:pStyle w:val="Compact"/>
+            </w:pPr>
+            <w:r>
+              <w:t xml:space="preserve">Quién</w:t>
+            </w:r>
+          </w:p>
+        </w:tc>
+        <w:tc>
+          <w:tcPr/>
+          <w:p>
+            <w:pPr>
+              <w:pStyle w:val="Compact"/>
+            </w:pPr>
+            <w:r>
+              <w:t xml:space="preserve">Qué tiene que poder hacer, y en qué formato</w:t>
+            </w:r>
+          </w:p>
+        </w:tc>
+        <w:tc>
+          <w:tcPr/>
+          <w:p>
+            <w:pPr>
+              <w:pStyle w:val="Compact"/>
+            </w:pPr>
+            <w:r>
+              <w:t xml:space="preserve">Qué se le dice, y quién lo dice</w:t>
+            </w:r>
+          </w:p>
+        </w:tc>
+      </w:tr>
+      <w:tr>
+        <w:tc>
+          <w:tcPr/>
+          <w:p>
+            <w:pPr>
+              <w:pStyle w:val="Compact"/>
+            </w:pPr>
+            <w:r>
+              <w:t xml:space="preserve">Ana y futuras comerciantes piloto</w:t>
+            </w:r>
+          </w:p>
+        </w:tc>
+        <w:tc>
+          <w:tcPr/>
+          <w:p>
+            <w:pPr>
+              <w:pStyle w:val="Compact"/>
+            </w:pPr>
+            <w:r>
+              <w:t xml:space="preserve">Registrar una venta real en menos de 3 segundos, sin ayuda, la primera vez que abren la app · pantalla de bienvenida de menos de 15 segundos dentro de la propia app (</w:t>
+            </w:r>
+            <w:r>
+              <w:rPr>
+                <w:rStyle w:val="VerbatimChar"/>
+              </w:rPr>
+              <w:t xml:space="preserve">demo-mode.md</w:t>
+            </w:r>
+            <w:r>
+              <w:t xml:space="preserve">), no un manual aparte</w:t>
+            </w:r>
+          </w:p>
+        </w:tc>
+        <w:tc>
+          <w:tcPr/>
+          <w:p>
+            <w:pPr>
+              <w:pStyle w:val="Compact"/>
+            </w:pPr>
+            <w:r>
+              <w:t xml:space="preserve">Que esto es un prototipo real, que todo lo que registren es real, y que hay una forma directa de decirme si algo no funcionó. Se lo digo yo directamente, no un correo genérico</w:t>
+            </w:r>
+          </w:p>
+        </w:tc>
+      </w:tr>
+      <w:tr>
+        <w:tc>
+          <w:tcPr/>
+          <w:p>
+            <w:pPr>
+              <w:pStyle w:val="Compact"/>
+            </w:pPr>
+            <w:r>
+              <w:t xml:space="preserve">Yo misma, operando el equipo de agentes</w:t>
+            </w:r>
+          </w:p>
+        </w:tc>
+        <w:tc>
+          <w:tcPr/>
+          <w:p>
+            <w:pPr>
+              <w:pStyle w:val="Compact"/>
+            </w:pPr>
+            <w:r>
+              <w:t xml:space="preserve">Saber qué tipo de decisión (Arquitectura, Producto o Negocio) le corresponde a cada agente, para no delegar de más ni de menos · el Anexo A de este mismo documento, mi propia referencia</w:t>
+            </w:r>
+          </w:p>
+        </w:tc>
+        <w:tc>
+          <w:tcPr/>
+          <w:p>
+            <w:pPr>
+              <w:pStyle w:val="Compact"/>
+            </w:pPr>
+            <w:r>
+              <w:t xml:space="preserve">Nadie más me lo dice todavía, es una disciplina que sostengo yo sola</w:t>
+            </w:r>
+          </w:p>
+        </w:tc>
+      </w:tr>
+    </w:tbl>
+    <w:p>
+      <w:pPr>
+        <w:pStyle w:val="BodyText"/>
+      </w:pPr>
+      <w:r>
+        <w:rPr>
+          <w:b/>
+          <w:bCs/>
+        </w:rPr>
+        <w:t xml:space="preserve">Hoja de ruta:</w:t>
+      </w:r>
+    </w:p>
+    <w:tbl>
+      <w:tblPr>
+        <w:tblStyle w:val="Table"/>
+        <w:tblW w:type="pct" w:w="5000"/>
+        <w:tblLayout w:type="fixed"/>
+        <w:tblLook w:firstRow="1" w:lastRow="0" w:firstColumn="0" w:lastColumn="0" w:noHBand="0" w:noVBand="0" w:val="0020"/>
+      </w:tblPr>
+      <w:tblGrid>
+        <w:gridCol w:w="2640"/>
+        <w:gridCol w:w="2640"/>
+        <w:gridCol w:w="2640"/>
+      </w:tblGrid>
+      <w:tr>
+        <w:trPr>
+          <w:tblHeader w:val="on"/>
+        </w:trPr>
+        <w:tc>
+          <w:tcPr/>
+          <w:p>
+            <w:pPr>
+              <w:pStyle w:val="Compact"/>
+            </w:pPr>
+            <w:r>
+              <w:t xml:space="preserve">Hito</w:t>
+            </w:r>
+          </w:p>
+        </w:tc>
+        <w:tc>
+          <w:tcPr/>
+          <w:p>
+            <w:pPr>
+              <w:pStyle w:val="Compact"/>
+            </w:pPr>
+            <w:r>
+              <w:t xml:space="preserve">Fecha</w:t>
+            </w:r>
+          </w:p>
+        </w:tc>
+        <w:tc>
+          <w:tcPr/>
+          <w:p>
+            <w:pPr>
+              <w:pStyle w:val="Compact"/>
+            </w:pPr>
+            <w:r>
+              <w:t xml:space="preserve">Responsable (nombre y cargo)</w:t>
+            </w:r>
+          </w:p>
+        </w:tc>
+      </w:tr>
+      <w:tr>
+        <w:tc>
+          <w:tcPr/>
+          <w:p>
+            <w:pPr>
+              <w:pStyle w:val="Compact"/>
+            </w:pPr>
+            <w:r>
+              <w:t xml:space="preserve">Piloto Concierge/DM diseñado, brand-revisado, listo para lanzar</w:t>
+            </w:r>
+          </w:p>
+        </w:tc>
+        <w:tc>
+          <w:tcPr/>
+          <w:p>
+            <w:pPr>
+              <w:pStyle w:val="Compact"/>
+            </w:pPr>
+            <w:r>
+              <w:t xml:space="preserve">Ya logrado, 20-22 ago 2026</w:t>
+            </w:r>
+          </w:p>
+        </w:tc>
+        <w:tc>
+          <w:tcPr/>
+          <w:p>
+            <w:pPr>
+              <w:pStyle w:val="Compact"/>
+            </w:pPr>
+            <w:r>
+              <w:t xml:space="preserve">Claudia Falcón, Fundadora</w:t>
+            </w:r>
+          </w:p>
+        </w:tc>
+      </w:tr>
+      <w:tr>
+        <w:tc>
+          <w:tcPr/>
+          <w:p>
+            <w:pPr>
+              <w:pStyle w:val="Compact"/>
+            </w:pPr>
+            <w:r>
+              <w:t xml:space="preserve">Piloto Concierge/DM lanzado y cerrado, causa real de no-adopción diagnosticada</w:t>
+            </w:r>
+          </w:p>
+        </w:tc>
+        <w:tc>
+          <w:tcPr/>
+          <w:p>
+            <w:pPr>
+              <w:pStyle w:val="Compact"/>
+            </w:pPr>
+            <w:r>
+              <w:t xml:space="preserve">Próximas 2 semanas</w:t>
+            </w:r>
+          </w:p>
+        </w:tc>
+        <w:tc>
+          <w:tcPr/>
+          <w:p>
+            <w:pPr>
+              <w:pStyle w:val="Compact"/>
+            </w:pPr>
+            <w:r>
+              <w:t xml:space="preserve">Claudia Falcón, Fundadora</w:t>
+            </w:r>
+          </w:p>
+        </w:tc>
+      </w:tr>
+      <w:tr>
+        <w:tc>
+          <w:tcPr/>
+          <w:p>
+            <w:pPr>
+              <w:pStyle w:val="Compact"/>
+            </w:pPr>
+            <w:r>
+              <w:t xml:space="preserve">Decisión de precio tomada (Business Decision, todavía abierta)</w:t>
+            </w:r>
+          </w:p>
+        </w:tc>
+        <w:tc>
+          <w:tcPr/>
+          <w:p>
+            <w:pPr>
+              <w:pStyle w:val="Compact"/>
+            </w:pPr>
+            <w:r>
+              <w:t xml:space="preserve">Antes de la siguiente ola de adquisición</w:t>
+            </w:r>
+          </w:p>
+        </w:tc>
+        <w:tc>
+          <w:tcPr/>
+          <w:p>
+            <w:pPr>
+              <w:pStyle w:val="Compact"/>
+            </w:pPr>
+            <w:r>
+              <w:t xml:space="preserve">Claudia Falcón, Fundadora</w:t>
+            </w:r>
+          </w:p>
+        </w:tc>
+      </w:tr>
+      <w:tr>
+        <w:tc>
+          <w:tcPr/>
+          <w:p>
+            <w:pPr>
+              <w:pStyle w:val="Compact"/>
+            </w:pPr>
+            <w:r>
+              <w:t xml:space="preserve">Solución técnica NFC confirmada</w:t>
+            </w:r>
+          </w:p>
+        </w:tc>
+        <w:tc>
+          <w:tcPr/>
+          <w:p>
+            <w:pPr>
+              <w:pStyle w:val="Compact"/>
+            </w:pPr>
+            <w:r>
+              <w:t xml:space="preserve">En curso, sin fecha cerrada</w:t>
+            </w:r>
+          </w:p>
+        </w:tc>
+        <w:tc>
+          <w:tcPr/>
+          <w:p>
+            <w:pPr>
+              <w:pStyle w:val="Compact"/>
+            </w:pPr>
+            <w:r>
+              <w:t xml:space="preserve">Claudia Falcón, Fundadora, con apoyo del agente</w:t>
             </w:r>
             <w:r>
               <w:t xml:space="preserve"> </w:t>
@@ -1697,35 +1993,6 @@
               </w:rPr>
               <w:t xml:space="preserve">architect</w:t>
             </w:r>
-            <w:r>
-              <w:t xml:space="preserve"> </w:t>
-            </w:r>
-            <w:r>
-              <w:t xml:space="preserve">+</w:t>
-            </w:r>
-            <w:r>
-              <w:t xml:space="preserve"> </w:t>
-            </w:r>
-            <w:r>
-              <w:rPr>
-                <w:rStyle w:val="VerbatimChar"/>
-              </w:rPr>
-              <w:t xml:space="preserve">knowledge-mentor</w:t>
-            </w:r>
-            <w:r>
-              <w:t xml:space="preserve">, ya despachado</w:t>
-            </w:r>
-          </w:p>
-        </w:tc>
-        <w:tc>
-          <w:tcPr/>
-          <w:p>
-            <w:pPr>
-              <w:pStyle w:val="Compact"/>
-            </w:pPr>
-            <w:r>
-              <w:t xml:space="preserve">En curso</w:t>
-            </w:r>
           </w:p>
         </w:tc>
       </w:tr>
@@ -1737,29 +2004,29 @@
               <w:pStyle w:val="Compact"/>
             </w:pPr>
             <w:r>
-              <w:t xml:space="preserve">Cadencia fija de revisión de decisiones abiertas</w:t>
-            </w:r>
-          </w:p>
-        </w:tc>
-        <w:tc>
-          <w:tcPr/>
-          <w:p>
-            <w:pPr>
-              <w:pStyle w:val="Compact"/>
-            </w:pPr>
-            <w:r>
-              <w:t xml:space="preserve">Claudia Falcón, Fundadora / Product Owner</w:t>
-            </w:r>
-          </w:p>
-        </w:tc>
-        <w:tc>
-          <w:tcPr/>
-          <w:p>
-            <w:pPr>
-              <w:pStyle w:val="Compact"/>
-            </w:pPr>
-            <w:r>
-              <w:t xml:space="preserve">Por definir</w:t>
+              <w:t xml:space="preserve">Cadencia fija de revisión de decisiones abiertas definida</w:t>
+            </w:r>
+          </w:p>
+        </w:tc>
+        <w:tc>
+          <w:tcPr/>
+          <w:p>
+            <w:pPr>
+              <w:pStyle w:val="Compact"/>
+            </w:pPr>
+            <w:r>
+              <w:t xml:space="preserve">Todavía sin definir, brecha real de gobernanza (ver Anexo A)</w:t>
+            </w:r>
+          </w:p>
+        </w:tc>
+        <w:tc>
+          <w:tcPr/>
+          <w:p>
+            <w:pPr>
+              <w:pStyle w:val="Compact"/>
+            </w:pPr>
+            <w:r>
+              <w:t xml:space="preserve">Claudia Falcón, Fundadora</w:t>
             </w:r>
           </w:p>
         </w:tc>

</xml_diff>

<commit_message>
docs(evidence): remove internal repo file references from Demo Day doc
The professor/panel has no access to and no context for internal paths
like company/backlog.md or product/00-foundation/CLAUDE.md - citing
them exposed more of the repo's internal structure than intended and
meant nothing to an outside reader anyway. Rewrote every instance to
describe what was decided/built in plain language instead. Anexo B's
diagram images untouched, as instructed.
</commit_message>
<xml_diff>
--- a/evidence/2026-08-22-demo-day/Nahui - Documento Ejecutivo Demo Day.docx
+++ b/evidence/2026-08-22-demo-day/Nahui - Documento Ejecutivo Demo Day.docx
@@ -247,19 +247,7 @@
         <w:t xml:space="preserve"> </w:t>
       </w:r>
       <w:r>
-        <w:t xml:space="preserve">registrar una venta real en el momento exacto en que ocurre, sin que el registro le cueste la siguiente venta. Es el job funcional que la libreta, la memoria, y las terminales de pago (que solo registran cuando hay tarjeta, no efectivo) no le resuelven hoy. Prototipo funcional real en</w:t>
-      </w:r>
-      <w:r>
-        <w:t xml:space="preserve"> </w:t>
-      </w:r>
-      <w:r>
-        <w:rPr>
-          <w:rStyle w:val="VerbatimChar"/>
-        </w:rPr>
-        <w:t xml:space="preserve">product/02c-high-fidelity-prototype/</w:t>
-      </w:r>
-      <w:r>
-        <w:t xml:space="preserve">.</w:t>
+        <w:t xml:space="preserve">registrar una venta real en el momento exacto en que ocurre, sin que el registro le cueste la siguiente venta. Es el job funcional que la libreta, la memoria, y las terminales de pago (que solo registran cuando hay tarjeta, no efectivo) no le resuelven hoy. Ya existe un prototipo funcional real, construido y probado con Ana.</w:t>
       </w:r>
     </w:p>
     <w:p>
@@ -333,7 +321,7 @@
         <w:t xml:space="preserve"> </w:t>
       </w:r>
       <w:r>
-        <w:t xml:space="preserve">el backlog del producto define desde el principio, antes de cualquier prueba con usuarios, la barra de éxito exacta:</w:t>
+        <w:t xml:space="preserve">desde el principio, antes de cualquier prueba con usuarios, definí la barra de éxito exacta:</w:t>
       </w:r>
       <w:r>
         <w:t xml:space="preserve"> </w:t>
@@ -343,25 +331,13 @@
           <w:b/>
           <w:bCs/>
         </w:rPr>
-        <w:t xml:space="preserve">90% o más de las ventas registradas, en menos de 3 segundos por registro</w:t>
-      </w:r>
-      <w:r>
-        <w:t xml:space="preserve"> </w:t>
-      </w:r>
-      <w:r>
-        <w:t xml:space="preserve">(</w:t>
-      </w:r>
-      <w:r>
-        <w:rPr>
-          <w:rStyle w:val="VerbatimChar"/>
-        </w:rPr>
-        <w:t xml:space="preserve">company/backlog.md</w:t>
-      </w:r>
-      <w:r>
-        <w:t xml:space="preserve"> </w:t>
-      </w:r>
-      <w:r>
-        <w:t xml:space="preserve">#1). No es un umbral inventado después del resultado, es la definición original del éxito del MVP.</w:t>
+        <w:t xml:space="preserve">90% o más de las ventas registradas, en menos de 3 segundos por registro.</w:t>
+      </w:r>
+      <w:r>
+        <w:t xml:space="preserve"> </w:t>
+      </w:r>
+      <w:r>
+        <w:t xml:space="preserve">No es un umbral inventado después del resultado, es la definición original del éxito del MVP.</w:t>
       </w:r>
     </w:p>
     <w:p>
@@ -858,16 +834,7 @@
         <w:t xml:space="preserve"> </w:t>
       </w:r>
       <w:r>
-        <w:t xml:space="preserve">todavía no lo puedo calcular de forma defendible. No existe una cifra de precio decidida (</w:t>
-      </w:r>
-      <w:r>
-        <w:rPr>
-          <w:rStyle w:val="VerbatimChar"/>
-        </w:rPr>
-        <w:t xml:space="preserve">company/business-decisions.md</w:t>
-      </w:r>
-      <w:r>
-        <w:t xml:space="preserve">), solo principios (sin comisión por transacción, precio fijo o estacional).</w:t>
+        <w:t xml:space="preserve">todavía no lo puedo calcular de forma defendible. No existe una cifra de precio decidida, solo principios (sin comisión por transacción, precio fijo o estacional).</w:t>
       </w:r>
     </w:p>
     <w:p>
@@ -1724,16 +1691,7 @@
               <w:pStyle w:val="Compact"/>
             </w:pPr>
             <w:r>
-              <w:t xml:space="preserve">Registrar una venta real en menos de 3 segundos, sin ayuda, la primera vez que abren la app · pantalla de bienvenida de menos de 15 segundos dentro de la propia app (</w:t>
-            </w:r>
-            <w:r>
-              <w:rPr>
-                <w:rStyle w:val="VerbatimChar"/>
-              </w:rPr>
-              <w:t xml:space="preserve">demo-mode.md</w:t>
-            </w:r>
-            <w:r>
-              <w:t xml:space="preserve">), no un manual aparte</w:t>
+              <w:t xml:space="preserve">Registrar una venta real en menos de 3 segundos, sin ayuda, la primera vez que abren la app · pantalla de bienvenida de menos de 15 segundos dentro de la propia app, no un manual aparte</w:t>
             </w:r>
           </w:p>
         </w:tc>
@@ -2723,99 +2681,12 @@
         <w:pStyle w:val="FirstParagraph"/>
       </w:pPr>
       <w:r>
-        <w:t xml:space="preserve">Cada carpeta principal del proyecto tiene su propio archivo</w:t>
-      </w:r>
-      <w:r>
-        <w:t xml:space="preserve"> </w:t>
-      </w:r>
-      <w:r>
-        <w:rPr>
-          <w:rStyle w:val="VerbatimChar"/>
-        </w:rPr>
-        <w:t xml:space="preserve">CLAUDE.md</w:t>
-      </w:r>
-      <w:r>
-        <w:t xml:space="preserve"> </w:t>
-      </w:r>
-      <w:r>
-        <w:t xml:space="preserve">que define las reglas de esa área específica, y ningún agente puede escribir fuera del área que le corresponde sin autorización explícita:</w:t>
-      </w:r>
-    </w:p>
-    <w:p>
-      <w:pPr>
-        <w:pStyle w:val="Compact"/>
-        <w:numPr>
-          <w:ilvl w:val="0"/>
-          <w:numId w:val="1002"/>
-        </w:numPr>
-      </w:pPr>
-      <w:r>
-        <w:rPr>
-          <w:rStyle w:val="VerbatimChar"/>
-        </w:rPr>
-        <w:t xml:space="preserve">company/CLAUDE.md</w:t>
-      </w:r>
-      <w:r>
-        <w:t xml:space="preserve">: quiénes somos, cómo opera el equipo de agentes, quién decide qué.</w:t>
-      </w:r>
-    </w:p>
-    <w:p>
-      <w:pPr>
-        <w:pStyle w:val="Compact"/>
-        <w:numPr>
-          <w:ilvl w:val="0"/>
-          <w:numId w:val="1002"/>
-        </w:numPr>
-      </w:pPr>
-      <w:r>
-        <w:rPr>
-          <w:rStyle w:val="VerbatimChar"/>
-        </w:rPr>
-        <w:t xml:space="preserve">product/00-foundation/CLAUDE.md</w:t>
-      </w:r>
-      <w:r>
-        <w:t xml:space="preserve">: el modelo de dominio congelado y los principios que no cambian sin pasar por un proceso formal.</w:t>
-      </w:r>
-    </w:p>
-    <w:p>
-      <w:pPr>
-        <w:pStyle w:val="Compact"/>
-        <w:numPr>
-          <w:ilvl w:val="0"/>
-          <w:numId w:val="1002"/>
-        </w:numPr>
-      </w:pPr>
-      <w:r>
-        <w:rPr>
-          <w:rStyle w:val="VerbatimChar"/>
-        </w:rPr>
-        <w:t xml:space="preserve">product/02-ux/CLAUDE.md</w:t>
-      </w:r>
-      <w:r>
-        <w:t xml:space="preserve">: las reglas de cómo se escriben las especificaciones de Baja Fidelidad.</w:t>
-      </w:r>
-    </w:p>
-    <w:p>
-      <w:pPr>
-        <w:pStyle w:val="Compact"/>
-        <w:numPr>
-          <w:ilvl w:val="0"/>
-          <w:numId w:val="1002"/>
-        </w:numPr>
-      </w:pPr>
-      <w:r>
-        <w:rPr>
-          <w:rStyle w:val="VerbatimChar"/>
-        </w:rPr>
-        <w:t xml:space="preserve">brand/CLAUDE.md</w:t>
-      </w:r>
-      <w:r>
-        <w:t xml:space="preserve">: la identidad de marca de largo plazo.</w:t>
-      </w:r>
-    </w:p>
-    <w:p>
-      <w:pPr>
-        <w:pStyle w:val="FirstParagraph"/>
+        <w:t xml:space="preserve">Cada área del proyecto (identidad y operación del equipo, modelo del negocio, especificaciones de diseño, identidad de marca) tiene su propio documento de reglas, separado de los demás, y ningún agente puede escribir fuera del área que le corresponde sin autorización explícita.</w:t>
+      </w:r>
+    </w:p>
+    <w:p>
+      <w:pPr>
+        <w:pStyle w:val="BodyText"/>
       </w:pPr>
       <w:r>
         <w:t xml:space="preserve">Esta separación no es solo organización de carpetas, es la forma concreta en la que</w:t>
@@ -3389,9 +3260,6 @@
     <w:abstractNumId w:val="990"/>
   </w:num>
   <w:num w:numId="1001">
-    <w:abstractNumId w:val="991"/>
-  </w:num>
-  <w:num w:numId="1002">
     <w:abstractNumId w:val="991"/>
   </w:num>
 </w:numbering>

</xml_diff>

<commit_message>
docs(evidence): restore file-hierarchy detail in Anexo A
Clarified scope: privacy cleanup was meant for the 7 main pages only.
Anexo A is a technical appendix, not one of the main pages, so the
actual internal governance file names stay.
</commit_message>
<xml_diff>
--- a/evidence/2026-08-22-demo-day/Nahui - Documento Ejecutivo Demo Day.docx
+++ b/evidence/2026-08-22-demo-day/Nahui - Documento Ejecutivo Demo Day.docx
@@ -2681,12 +2681,99 @@
         <w:pStyle w:val="FirstParagraph"/>
       </w:pPr>
       <w:r>
-        <w:t xml:space="preserve">Cada área del proyecto (identidad y operación del equipo, modelo del negocio, especificaciones de diseño, identidad de marca) tiene su propio documento de reglas, separado de los demás, y ningún agente puede escribir fuera del área que le corresponde sin autorización explícita.</w:t>
-      </w:r>
-    </w:p>
-    <w:p>
-      <w:pPr>
-        <w:pStyle w:val="BodyText"/>
+        <w:t xml:space="preserve">Cada carpeta principal del proyecto tiene su propio archivo</w:t>
+      </w:r>
+      <w:r>
+        <w:t xml:space="preserve"> </w:t>
+      </w:r>
+      <w:r>
+        <w:rPr>
+          <w:rStyle w:val="VerbatimChar"/>
+        </w:rPr>
+        <w:t xml:space="preserve">CLAUDE.md</w:t>
+      </w:r>
+      <w:r>
+        <w:t xml:space="preserve"> </w:t>
+      </w:r>
+      <w:r>
+        <w:t xml:space="preserve">que define las reglas de esa área específica, y ningún agente puede escribir fuera del área que le corresponde sin autorización explícita:</w:t>
+      </w:r>
+    </w:p>
+    <w:p>
+      <w:pPr>
+        <w:pStyle w:val="Compact"/>
+        <w:numPr>
+          <w:ilvl w:val="0"/>
+          <w:numId w:val="1002"/>
+        </w:numPr>
+      </w:pPr>
+      <w:r>
+        <w:rPr>
+          <w:rStyle w:val="VerbatimChar"/>
+        </w:rPr>
+        <w:t xml:space="preserve">company/CLAUDE.md</w:t>
+      </w:r>
+      <w:r>
+        <w:t xml:space="preserve">: quiénes somos, cómo opera el equipo de agentes, quién decide qué.</w:t>
+      </w:r>
+    </w:p>
+    <w:p>
+      <w:pPr>
+        <w:pStyle w:val="Compact"/>
+        <w:numPr>
+          <w:ilvl w:val="0"/>
+          <w:numId w:val="1002"/>
+        </w:numPr>
+      </w:pPr>
+      <w:r>
+        <w:rPr>
+          <w:rStyle w:val="VerbatimChar"/>
+        </w:rPr>
+        <w:t xml:space="preserve">product/00-foundation/CLAUDE.md</w:t>
+      </w:r>
+      <w:r>
+        <w:t xml:space="preserve">: el modelo de dominio congelado y los principios que no cambian sin pasar por un proceso formal.</w:t>
+      </w:r>
+    </w:p>
+    <w:p>
+      <w:pPr>
+        <w:pStyle w:val="Compact"/>
+        <w:numPr>
+          <w:ilvl w:val="0"/>
+          <w:numId w:val="1002"/>
+        </w:numPr>
+      </w:pPr>
+      <w:r>
+        <w:rPr>
+          <w:rStyle w:val="VerbatimChar"/>
+        </w:rPr>
+        <w:t xml:space="preserve">product/02-ux/CLAUDE.md</w:t>
+      </w:r>
+      <w:r>
+        <w:t xml:space="preserve">: las reglas de cómo se escriben las especificaciones de Baja Fidelidad.</w:t>
+      </w:r>
+    </w:p>
+    <w:p>
+      <w:pPr>
+        <w:pStyle w:val="Compact"/>
+        <w:numPr>
+          <w:ilvl w:val="0"/>
+          <w:numId w:val="1002"/>
+        </w:numPr>
+      </w:pPr>
+      <w:r>
+        <w:rPr>
+          <w:rStyle w:val="VerbatimChar"/>
+        </w:rPr>
+        <w:t xml:space="preserve">brand/CLAUDE.md</w:t>
+      </w:r>
+      <w:r>
+        <w:t xml:space="preserve">: la identidad de marca de largo plazo.</w:t>
+      </w:r>
+    </w:p>
+    <w:p>
+      <w:pPr>
+        <w:pStyle w:val="FirstParagraph"/>
       </w:pPr>
       <w:r>
         <w:t xml:space="preserve">Esta separación no es solo organización de carpetas, es la forma concreta en la que</w:t>
@@ -3260,6 +3347,9 @@
     <w:abstractNumId w:val="990"/>
   </w:num>
   <w:num w:numId="1001">
+    <w:abstractNumId w:val="991"/>
+  </w:num>
+  <w:num w:numId="1002">
     <w:abstractNumId w:val="991"/>
   </w:num>
 </w:numbering>

</xml_diff>

<commit_message>
fix(evidence): NFC solution was already resolved 2026-08-12, not pending
Corrected Section 4 and the Hoja de ruta table, which both still said
this was under investigation. The real resolution: Web NFC for Android
inside the existing PWA, unchanged; a thin native shell with a Core NFC
bridge for iOS, scoped only to the NFC feature, not a full separate
app; pilot distribution via TestFlight.
</commit_message>
<xml_diff>
--- a/evidence/2026-08-22-demo-day/Nahui - Documento Ejecutivo Demo Day.docx
+++ b/evidence/2026-08-22-demo-day/Nahui - Documento Ejecutivo Demo Day.docx
@@ -591,7 +591,7 @@
         <w:t xml:space="preserve"> </w:t>
       </w:r>
       <w:r>
-        <w:t xml:space="preserve">autenticación por teléfono más código OTP vía Supabase Auth, ya decidido. Lectura NFC bajo investigación activa. Web NFC cubre Android/Chrome pero no iOS Safari, y el requisito real de negocio, que Ana nunca necesite comprar un lector aparte, todavía no tiene solución confirmada.</w:t>
+        <w:t xml:space="preserve">autenticación por teléfono más código OTP vía Supabase Auth, ya decidido. Lectura NFC, resuelta: en Android uso Web NFC dentro del mismo PWA, sin ningún cambio. Web NFC no funciona en iOS Safari, así que para iOS envuelvo el mismo código en un shell nativo delgado con un puente a Core NFC, solo para esa función específica, no una segunda app nativa completa. El requisito real de negocio, que Ana nunca necesite comprar un lector aparte, queda cubierto en ambos casos.</w:t>
       </w:r>
       <w:r>
         <w:t xml:space="preserve"> </w:t>
@@ -1918,38 +1918,29 @@
               <w:pStyle w:val="Compact"/>
             </w:pPr>
             <w:r>
-              <w:t xml:space="preserve">Solución técnica NFC confirmada</w:t>
-            </w:r>
-          </w:p>
-        </w:tc>
-        <w:tc>
-          <w:tcPr/>
-          <w:p>
-            <w:pPr>
-              <w:pStyle w:val="Compact"/>
-            </w:pPr>
-            <w:r>
-              <w:t xml:space="preserve">En curso, sin fecha cerrada</w:t>
-            </w:r>
-          </w:p>
-        </w:tc>
-        <w:tc>
-          <w:tcPr/>
-          <w:p>
-            <w:pPr>
-              <w:pStyle w:val="Compact"/>
-            </w:pPr>
-            <w:r>
-              <w:t xml:space="preserve">Claudia Falcón, Fundadora, con apoyo del agente</w:t>
-            </w:r>
-            <w:r>
-              <w:t xml:space="preserve"> </w:t>
-            </w:r>
-            <w:r>
-              <w:rPr>
-                <w:rStyle w:val="VerbatimChar"/>
-              </w:rPr>
-              <w:t xml:space="preserve">architect</w:t>
+              <w:t xml:space="preserve">Solución técnica NFC confirmada (shell nativo con Core NFC para iOS, Web NFC para Android, distribución piloto por TestFlight)</w:t>
+            </w:r>
+          </w:p>
+        </w:tc>
+        <w:tc>
+          <w:tcPr/>
+          <w:p>
+            <w:pPr>
+              <w:pStyle w:val="Compact"/>
+            </w:pPr>
+            <w:r>
+              <w:t xml:space="preserve">Ya logrado, 12 ago 2026</w:t>
+            </w:r>
+          </w:p>
+        </w:tc>
+        <w:tc>
+          <w:tcPr/>
+          <w:p>
+            <w:pPr>
+              <w:pStyle w:val="Compact"/>
+            </w:pPr>
+            <w:r>
+              <w:t xml:space="preserve">Claudia Falcón, Fundadora</w:t>
             </w:r>
           </w:p>
         </w:tc>

</xml_diff>

<commit_message>
fix(evidence): replace anglicism "roster" with "equipo" throughout
Both the text (two mentions) and the diagram image itself used
"roster", an English loanword that reads oddly in the Spanish
document. Fixed all three, including re-rendering the affected
diagram section.
</commit_message>
<xml_diff>
--- a/evidence/2026-08-22-demo-day/Nahui - Documento Ejecutivo Demo Day.docx
+++ b/evidence/2026-08-22-demo-day/Nahui - Documento Ejecutivo Demo Day.docx
@@ -893,7 +893,7 @@
         <w:t xml:space="preserve">“se decide en el pasillo”</w:t>
       </w:r>
       <w:r>
-        <w:t xml:space="preserve">) funcionando en un caso real. El roster completo de agentes y cómo se gobiernan está en el Anexo A.</w:t>
+        <w:t xml:space="preserve">) funcionando en un caso real. El equipo completo de agentes y cómo se gobiernan está en el Anexo A.</w:t>
       </w:r>
     </w:p>
     <w:p>
@@ -2164,13 +2164,13 @@
         <w:t xml:space="preserve">(Anexo, no cuenta contra el límite de 7 páginas.)</w:t>
       </w:r>
     </w:p>
-    <w:bookmarkStart w:id="16" w:name="X15126714b4fa16c45fe24244a4cab857f5991b7"/>
+    <w:bookmarkStart w:id="16" w:name="X1abd0f0684a05c75641898ec4a90229d7a4009b"/>
     <w:p>
       <w:pPr>
         <w:pStyle w:val="Heading3"/>
       </w:pPr>
       <w:r>
-        <w:t xml:space="preserve">A.1 El roster de agentes y qué autoridad tiene cada uno</w:t>
+        <w:t xml:space="preserve">A.1 El equipo de agentes y qué autoridad tiene cada uno</w:t>
       </w:r>
     </w:p>
     <w:p>

</xml_diff>